<commit_message>
Working on Homework 6 and lecture notebooks
</commit_message>
<xml_diff>
--- a/assignments/FIN-220-F25-HW6.docx
+++ b/assignments/FIN-220-F25-HW6.docx
@@ -280,6 +280,2462 @@
     </w:p>
     <w:p>
       <w:pPr>
+        <w:spacing w:line="334" w:lineRule="auto"/>
+        <w:ind w:left="0" w:firstLine="0"/>
+      </w:pPr>
+      <w:r>
+        <w:t>(</w:t>
+      </w:r>
+      <w:proofErr w:type="spellStart"/>
+      <w:r>
+        <w:rPr>
+          <w:i/>
+        </w:rPr>
+        <w:t>a</w:t>
+      </w:r>
+      <w:r>
+        <w:rPr>
+          <w:i/>
+          <w:vertAlign w:val="superscript"/>
+        </w:rPr>
+        <w:t>T</w:t>
+      </w:r>
+      <w:r>
+        <w:rPr>
+          <w:i/>
+        </w:rPr>
+        <w:t>b</w:t>
+      </w:r>
+      <w:proofErr w:type="spellEnd"/>
+      <w:r>
+        <w:t>)</w:t>
+      </w:r>
+      <w:r>
+        <w:rPr>
+          <w:vertAlign w:val="superscript"/>
+        </w:rPr>
+        <w:t>3</w:t>
+      </w:r>
+      <w:r>
+        <w:t xml:space="preserve"> </w:t>
+      </w:r>
+      <w:r>
+        <w:t>=</w:t>
+      </w:r>
+    </w:p>
+    <w:p>
+      <w:pPr>
+        <w:spacing w:line="334" w:lineRule="auto"/>
+        <w:jc w:val="left"/>
+      </w:pPr>
+      <m:oMath>
+        <m:sSup>
+          <m:sSupPr>
+            <m:ctrlPr>
+              <w:rPr>
+                <w:rFonts w:ascii="Cambria Math" w:hAnsi="Cambria Math"/>
+                <w:i/>
+              </w:rPr>
+            </m:ctrlPr>
+          </m:sSupPr>
+          <m:e>
+            <m:d>
+              <m:dPr>
+                <m:ctrlPr>
+                  <w:rPr>
+                    <w:rFonts w:ascii="Cambria Math" w:hAnsi="Cambria Math"/>
+                    <w:i/>
+                  </w:rPr>
+                </m:ctrlPr>
+              </m:dPr>
+              <m:e>
+                <m:sSub>
+                  <m:sSubPr>
+                    <m:ctrlPr>
+                      <w:rPr>
+                        <w:rFonts w:ascii="Cambria Math" w:hAnsi="Cambria Math"/>
+                        <w:i/>
+                      </w:rPr>
+                    </m:ctrlPr>
+                  </m:sSubPr>
+                  <m:e>
+                    <m:r>
+                      <w:rPr>
+                        <w:rFonts w:ascii="Cambria Math" w:hAnsi="Cambria Math"/>
+                      </w:rPr>
+                      <m:t>a</m:t>
+                    </m:r>
+                  </m:e>
+                  <m:sub>
+                    <m:r>
+                      <w:rPr>
+                        <w:rFonts w:ascii="Cambria Math" w:hAnsi="Cambria Math"/>
+                      </w:rPr>
+                      <m:t>1</m:t>
+                    </m:r>
+                  </m:sub>
+                </m:sSub>
+                <m:sSub>
+                  <m:sSubPr>
+                    <m:ctrlPr>
+                      <w:rPr>
+                        <w:rFonts w:ascii="Cambria Math" w:hAnsi="Cambria Math"/>
+                        <w:i/>
+                      </w:rPr>
+                    </m:ctrlPr>
+                  </m:sSubPr>
+                  <m:e>
+                    <m:r>
+                      <w:rPr>
+                        <w:rFonts w:ascii="Cambria Math" w:hAnsi="Cambria Math"/>
+                      </w:rPr>
+                      <m:t>b</m:t>
+                    </m:r>
+                  </m:e>
+                  <m:sub>
+                    <m:r>
+                      <w:rPr>
+                        <w:rFonts w:ascii="Cambria Math" w:hAnsi="Cambria Math"/>
+                      </w:rPr>
+                      <m:t>1</m:t>
+                    </m:r>
+                  </m:sub>
+                </m:sSub>
+              </m:e>
+            </m:d>
+          </m:e>
+          <m:sup>
+            <m:r>
+              <w:rPr>
+                <w:rFonts w:ascii="Cambria Math" w:hAnsi="Cambria Math"/>
+              </w:rPr>
+              <m:t>3</m:t>
+            </m:r>
+          </m:sup>
+        </m:sSup>
+        <m:r>
+          <w:rPr>
+            <w:rFonts w:ascii="Cambria Math" w:hAnsi="Cambria Math"/>
+          </w:rPr>
+          <m:t>+</m:t>
+        </m:r>
+        <m:sSup>
+          <m:sSupPr>
+            <m:ctrlPr>
+              <w:rPr>
+                <w:rFonts w:ascii="Cambria Math" w:hAnsi="Cambria Math"/>
+                <w:i/>
+              </w:rPr>
+            </m:ctrlPr>
+          </m:sSupPr>
+          <m:e>
+            <m:r>
+              <w:rPr>
+                <w:rFonts w:ascii="Cambria Math" w:hAnsi="Cambria Math"/>
+              </w:rPr>
+              <m:t>3</m:t>
+            </m:r>
+            <m:d>
+              <m:dPr>
+                <m:ctrlPr>
+                  <w:rPr>
+                    <w:rFonts w:ascii="Cambria Math" w:hAnsi="Cambria Math"/>
+                    <w:i/>
+                  </w:rPr>
+                </m:ctrlPr>
+              </m:dPr>
+              <m:e>
+                <m:sSub>
+                  <m:sSubPr>
+                    <m:ctrlPr>
+                      <w:rPr>
+                        <w:rFonts w:ascii="Cambria Math" w:hAnsi="Cambria Math"/>
+                        <w:i/>
+                      </w:rPr>
+                    </m:ctrlPr>
+                  </m:sSubPr>
+                  <m:e>
+                    <m:r>
+                      <w:rPr>
+                        <w:rFonts w:ascii="Cambria Math" w:hAnsi="Cambria Math"/>
+                      </w:rPr>
+                      <m:t>a</m:t>
+                    </m:r>
+                  </m:e>
+                  <m:sub>
+                    <m:r>
+                      <w:rPr>
+                        <w:rFonts w:ascii="Cambria Math" w:hAnsi="Cambria Math"/>
+                      </w:rPr>
+                      <m:t>1</m:t>
+                    </m:r>
+                  </m:sub>
+                </m:sSub>
+                <m:sSub>
+                  <m:sSubPr>
+                    <m:ctrlPr>
+                      <w:rPr>
+                        <w:rFonts w:ascii="Cambria Math" w:hAnsi="Cambria Math"/>
+                        <w:i/>
+                      </w:rPr>
+                    </m:ctrlPr>
+                  </m:sSubPr>
+                  <m:e>
+                    <m:r>
+                      <w:rPr>
+                        <w:rFonts w:ascii="Cambria Math" w:hAnsi="Cambria Math"/>
+                      </w:rPr>
+                      <m:t>b</m:t>
+                    </m:r>
+                  </m:e>
+                  <m:sub>
+                    <m:r>
+                      <w:rPr>
+                        <w:rFonts w:ascii="Cambria Math" w:hAnsi="Cambria Math"/>
+                      </w:rPr>
+                      <m:t>1</m:t>
+                    </m:r>
+                  </m:sub>
+                </m:sSub>
+              </m:e>
+            </m:d>
+          </m:e>
+          <m:sup>
+            <m:r>
+              <w:rPr>
+                <w:rFonts w:ascii="Cambria Math" w:hAnsi="Cambria Math"/>
+              </w:rPr>
+              <m:t>2</m:t>
+            </m:r>
+          </m:sup>
+        </m:sSup>
+        <m:r>
+          <w:rPr>
+            <w:rFonts w:ascii="Cambria Math" w:hAnsi="Cambria Math"/>
+          </w:rPr>
+          <m:t xml:space="preserve"> </m:t>
+        </m:r>
+        <m:sSub>
+          <m:sSubPr>
+            <m:ctrlPr>
+              <w:rPr>
+                <w:rFonts w:ascii="Cambria Math" w:hAnsi="Cambria Math"/>
+                <w:i/>
+              </w:rPr>
+            </m:ctrlPr>
+          </m:sSubPr>
+          <m:e>
+            <m:r>
+              <w:rPr>
+                <w:rFonts w:ascii="Cambria Math" w:hAnsi="Cambria Math"/>
+              </w:rPr>
+              <m:t>a</m:t>
+            </m:r>
+          </m:e>
+          <m:sub>
+            <m:r>
+              <w:rPr>
+                <w:rFonts w:ascii="Cambria Math" w:hAnsi="Cambria Math"/>
+              </w:rPr>
+              <m:t>2</m:t>
+            </m:r>
+          </m:sub>
+        </m:sSub>
+        <m:sSub>
+          <m:sSubPr>
+            <m:ctrlPr>
+              <w:rPr>
+                <w:rFonts w:ascii="Cambria Math" w:hAnsi="Cambria Math"/>
+                <w:i/>
+              </w:rPr>
+            </m:ctrlPr>
+          </m:sSubPr>
+          <m:e>
+            <m:r>
+              <w:rPr>
+                <w:rFonts w:ascii="Cambria Math" w:hAnsi="Cambria Math"/>
+              </w:rPr>
+              <m:t>b</m:t>
+            </m:r>
+          </m:e>
+          <m:sub>
+            <m:r>
+              <w:rPr>
+                <w:rFonts w:ascii="Cambria Math" w:hAnsi="Cambria Math"/>
+              </w:rPr>
+              <m:t>2</m:t>
+            </m:r>
+          </m:sub>
+        </m:sSub>
+        <m:r>
+          <w:rPr>
+            <w:rFonts w:ascii="Cambria Math" w:hAnsi="Cambria Math"/>
+          </w:rPr>
+          <m:t xml:space="preserve">+ </m:t>
+        </m:r>
+        <m:r>
+          <w:rPr>
+            <w:rFonts w:ascii="Cambria Math" w:hAnsi="Cambria Math"/>
+          </w:rPr>
+          <m:t>3</m:t>
+        </m:r>
+        <m:d>
+          <m:dPr>
+            <m:ctrlPr>
+              <w:rPr>
+                <w:rFonts w:ascii="Cambria Math" w:hAnsi="Cambria Math"/>
+                <w:i/>
+              </w:rPr>
+            </m:ctrlPr>
+          </m:dPr>
+          <m:e>
+            <m:sSub>
+              <m:sSubPr>
+                <m:ctrlPr>
+                  <w:rPr>
+                    <w:rFonts w:ascii="Cambria Math" w:hAnsi="Cambria Math"/>
+                    <w:i/>
+                  </w:rPr>
+                </m:ctrlPr>
+              </m:sSubPr>
+              <m:e>
+                <m:r>
+                  <w:rPr>
+                    <w:rFonts w:ascii="Cambria Math" w:hAnsi="Cambria Math"/>
+                  </w:rPr>
+                  <m:t>a</m:t>
+                </m:r>
+              </m:e>
+              <m:sub>
+                <m:r>
+                  <w:rPr>
+                    <w:rFonts w:ascii="Cambria Math" w:hAnsi="Cambria Math"/>
+                  </w:rPr>
+                  <m:t>1</m:t>
+                </m:r>
+              </m:sub>
+            </m:sSub>
+            <m:sSub>
+              <m:sSubPr>
+                <m:ctrlPr>
+                  <w:rPr>
+                    <w:rFonts w:ascii="Cambria Math" w:hAnsi="Cambria Math"/>
+                    <w:i/>
+                  </w:rPr>
+                </m:ctrlPr>
+              </m:sSubPr>
+              <m:e>
+                <m:r>
+                  <w:rPr>
+                    <w:rFonts w:ascii="Cambria Math" w:hAnsi="Cambria Math"/>
+                  </w:rPr>
+                  <m:t>b</m:t>
+                </m:r>
+              </m:e>
+              <m:sub>
+                <m:r>
+                  <w:rPr>
+                    <w:rFonts w:ascii="Cambria Math" w:hAnsi="Cambria Math"/>
+                  </w:rPr>
+                  <m:t>1</m:t>
+                </m:r>
+              </m:sub>
+            </m:sSub>
+          </m:e>
+        </m:d>
+        <m:sSup>
+          <m:sSupPr>
+            <m:ctrlPr>
+              <w:rPr>
+                <w:rFonts w:ascii="Cambria Math" w:hAnsi="Cambria Math"/>
+                <w:i/>
+              </w:rPr>
+            </m:ctrlPr>
+          </m:sSupPr>
+          <m:e>
+            <m:d>
+              <m:dPr>
+                <m:ctrlPr>
+                  <w:rPr>
+                    <w:rFonts w:ascii="Cambria Math" w:hAnsi="Cambria Math"/>
+                    <w:i/>
+                  </w:rPr>
+                </m:ctrlPr>
+              </m:dPr>
+              <m:e>
+                <m:sSub>
+                  <m:sSubPr>
+                    <m:ctrlPr>
+                      <w:rPr>
+                        <w:rFonts w:ascii="Cambria Math" w:hAnsi="Cambria Math"/>
+                        <w:i/>
+                      </w:rPr>
+                    </m:ctrlPr>
+                  </m:sSubPr>
+                  <m:e>
+                    <m:r>
+                      <w:rPr>
+                        <w:rFonts w:ascii="Cambria Math" w:hAnsi="Cambria Math"/>
+                      </w:rPr>
+                      <m:t>a</m:t>
+                    </m:r>
+                  </m:e>
+                  <m:sub>
+                    <m:r>
+                      <w:rPr>
+                        <w:rFonts w:ascii="Cambria Math" w:hAnsi="Cambria Math"/>
+                      </w:rPr>
+                      <m:t>2</m:t>
+                    </m:r>
+                  </m:sub>
+                </m:sSub>
+                <m:sSub>
+                  <m:sSubPr>
+                    <m:ctrlPr>
+                      <w:rPr>
+                        <w:rFonts w:ascii="Cambria Math" w:hAnsi="Cambria Math"/>
+                        <w:i/>
+                      </w:rPr>
+                    </m:ctrlPr>
+                  </m:sSubPr>
+                  <m:e>
+                    <m:r>
+                      <w:rPr>
+                        <w:rFonts w:ascii="Cambria Math" w:hAnsi="Cambria Math"/>
+                      </w:rPr>
+                      <m:t>b</m:t>
+                    </m:r>
+                  </m:e>
+                  <m:sub>
+                    <m:r>
+                      <w:rPr>
+                        <w:rFonts w:ascii="Cambria Math" w:hAnsi="Cambria Math"/>
+                      </w:rPr>
+                      <m:t>2</m:t>
+                    </m:r>
+                  </m:sub>
+                </m:sSub>
+              </m:e>
+            </m:d>
+          </m:e>
+          <m:sup>
+            <m:r>
+              <w:rPr>
+                <w:rFonts w:ascii="Cambria Math" w:hAnsi="Cambria Math"/>
+              </w:rPr>
+              <m:t>2</m:t>
+            </m:r>
+          </m:sup>
+        </m:sSup>
+        <m:r>
+          <w:rPr>
+            <w:rFonts w:ascii="Cambria Math" w:hAnsi="Cambria Math"/>
+          </w:rPr>
+          <m:t>+</m:t>
+        </m:r>
+        <m:sSup>
+          <m:sSupPr>
+            <m:ctrlPr>
+              <w:rPr>
+                <w:rFonts w:ascii="Cambria Math" w:hAnsi="Cambria Math"/>
+                <w:i/>
+              </w:rPr>
+            </m:ctrlPr>
+          </m:sSupPr>
+          <m:e>
+            <m:d>
+              <m:dPr>
+                <m:ctrlPr>
+                  <w:rPr>
+                    <w:rFonts w:ascii="Cambria Math" w:hAnsi="Cambria Math"/>
+                    <w:i/>
+                  </w:rPr>
+                </m:ctrlPr>
+              </m:dPr>
+              <m:e>
+                <m:sSub>
+                  <m:sSubPr>
+                    <m:ctrlPr>
+                      <w:rPr>
+                        <w:rFonts w:ascii="Cambria Math" w:hAnsi="Cambria Math"/>
+                        <w:i/>
+                      </w:rPr>
+                    </m:ctrlPr>
+                  </m:sSubPr>
+                  <m:e>
+                    <m:r>
+                      <w:rPr>
+                        <w:rFonts w:ascii="Cambria Math" w:hAnsi="Cambria Math"/>
+                      </w:rPr>
+                      <m:t>a</m:t>
+                    </m:r>
+                  </m:e>
+                  <m:sub>
+                    <m:r>
+                      <w:rPr>
+                        <w:rFonts w:ascii="Cambria Math" w:hAnsi="Cambria Math"/>
+                      </w:rPr>
+                      <m:t>2</m:t>
+                    </m:r>
+                  </m:sub>
+                </m:sSub>
+                <m:sSub>
+                  <m:sSubPr>
+                    <m:ctrlPr>
+                      <w:rPr>
+                        <w:rFonts w:ascii="Cambria Math" w:hAnsi="Cambria Math"/>
+                        <w:i/>
+                      </w:rPr>
+                    </m:ctrlPr>
+                  </m:sSubPr>
+                  <m:e>
+                    <m:r>
+                      <w:rPr>
+                        <w:rFonts w:ascii="Cambria Math" w:hAnsi="Cambria Math"/>
+                      </w:rPr>
+                      <m:t>b</m:t>
+                    </m:r>
+                  </m:e>
+                  <m:sub>
+                    <m:r>
+                      <w:rPr>
+                        <w:rFonts w:ascii="Cambria Math" w:hAnsi="Cambria Math"/>
+                      </w:rPr>
+                      <m:t>2</m:t>
+                    </m:r>
+                  </m:sub>
+                </m:sSub>
+                <m:r>
+                  <w:rPr>
+                    <w:rFonts w:ascii="Cambria Math" w:hAnsi="Cambria Math"/>
+                  </w:rPr>
+                  <m:t xml:space="preserve"> </m:t>
+                </m:r>
+              </m:e>
+            </m:d>
+          </m:e>
+          <m:sup>
+            <m:r>
+              <w:rPr>
+                <w:rFonts w:ascii="Cambria Math" w:hAnsi="Cambria Math"/>
+              </w:rPr>
+              <m:t>3</m:t>
+            </m:r>
+          </m:sup>
+        </m:sSup>
+      </m:oMath>
+      <w:r>
+        <w:t xml:space="preserve"> </w:t>
+      </w:r>
+    </w:p>
+    <w:p>
+      <w:pPr>
+        <w:spacing w:line="334" w:lineRule="auto"/>
+      </w:pPr>
+      <m:oMathPara>
+        <m:oMathParaPr>
+          <m:jc m:val="left"/>
+        </m:oMathParaPr>
+        <m:oMath>
+          <m:sSup>
+            <m:sSupPr>
+              <m:ctrlPr>
+                <w:rPr>
+                  <w:rFonts w:ascii="Cambria Math" w:hAnsi="Cambria Math"/>
+                  <w:i/>
+                </w:rPr>
+              </m:ctrlPr>
+            </m:sSupPr>
+            <m:e>
+              <m:sSub>
+                <m:sSubPr>
+                  <m:ctrlPr>
+                    <w:rPr>
+                      <w:rFonts w:ascii="Cambria Math" w:hAnsi="Cambria Math"/>
+                      <w:i/>
+                    </w:rPr>
+                  </m:ctrlPr>
+                </m:sSubPr>
+                <m:e>
+                  <m:r>
+                    <w:rPr>
+                      <w:rFonts w:ascii="Cambria Math" w:hAnsi="Cambria Math"/>
+                    </w:rPr>
+                    <m:t>a</m:t>
+                  </m:r>
+                </m:e>
+                <m:sub>
+                  <m:r>
+                    <w:rPr>
+                      <w:rFonts w:ascii="Cambria Math" w:hAnsi="Cambria Math"/>
+                    </w:rPr>
+                    <m:t>1</m:t>
+                  </m:r>
+                </m:sub>
+              </m:sSub>
+            </m:e>
+            <m:sup>
+              <m:r>
+                <w:rPr>
+                  <w:rFonts w:ascii="Cambria Math" w:hAnsi="Cambria Math"/>
+                </w:rPr>
+                <m:t>3</m:t>
+              </m:r>
+            </m:sup>
+          </m:sSup>
+          <m:sSup>
+            <m:sSupPr>
+              <m:ctrlPr>
+                <w:rPr>
+                  <w:rFonts w:ascii="Cambria Math" w:hAnsi="Cambria Math"/>
+                  <w:i/>
+                </w:rPr>
+              </m:ctrlPr>
+            </m:sSupPr>
+            <m:e>
+              <m:sSub>
+                <m:sSubPr>
+                  <m:ctrlPr>
+                    <w:rPr>
+                      <w:rFonts w:ascii="Cambria Math" w:hAnsi="Cambria Math"/>
+                      <w:i/>
+                    </w:rPr>
+                  </m:ctrlPr>
+                </m:sSubPr>
+                <m:e>
+                  <m:r>
+                    <w:rPr>
+                      <w:rFonts w:ascii="Cambria Math" w:hAnsi="Cambria Math"/>
+                    </w:rPr>
+                    <m:t>b</m:t>
+                  </m:r>
+                </m:e>
+                <m:sub>
+                  <m:r>
+                    <w:rPr>
+                      <w:rFonts w:ascii="Cambria Math" w:hAnsi="Cambria Math"/>
+                    </w:rPr>
+                    <m:t>1</m:t>
+                  </m:r>
+                </m:sub>
+              </m:sSub>
+            </m:e>
+            <m:sup>
+              <m:r>
+                <w:rPr>
+                  <w:rFonts w:ascii="Cambria Math" w:hAnsi="Cambria Math"/>
+                </w:rPr>
+                <m:t>3</m:t>
+              </m:r>
+            </m:sup>
+          </m:sSup>
+          <m:r>
+            <w:rPr>
+              <w:rFonts w:ascii="Cambria Math" w:hAnsi="Cambria Math"/>
+            </w:rPr>
+            <m:t>+</m:t>
+          </m:r>
+          <m:sSup>
+            <m:sSupPr>
+              <m:ctrlPr>
+                <w:rPr>
+                  <w:rFonts w:ascii="Cambria Math" w:hAnsi="Cambria Math"/>
+                  <w:i/>
+                </w:rPr>
+              </m:ctrlPr>
+            </m:sSupPr>
+            <m:e>
+              <m:sSub>
+                <m:sSubPr>
+                  <m:ctrlPr>
+                    <w:rPr>
+                      <w:rFonts w:ascii="Cambria Math" w:hAnsi="Cambria Math"/>
+                      <w:i/>
+                    </w:rPr>
+                  </m:ctrlPr>
+                </m:sSubPr>
+                <m:e>
+                  <m:r>
+                    <w:rPr>
+                      <w:rFonts w:ascii="Cambria Math" w:hAnsi="Cambria Math"/>
+                    </w:rPr>
+                    <m:t>3</m:t>
+                  </m:r>
+                  <m:r>
+                    <w:rPr>
+                      <w:rFonts w:ascii="Cambria Math" w:hAnsi="Cambria Math"/>
+                    </w:rPr>
+                    <m:t>a</m:t>
+                  </m:r>
+                </m:e>
+                <m:sub>
+                  <m:r>
+                    <w:rPr>
+                      <w:rFonts w:ascii="Cambria Math" w:hAnsi="Cambria Math"/>
+                    </w:rPr>
+                    <m:t>1</m:t>
+                  </m:r>
+                </m:sub>
+              </m:sSub>
+            </m:e>
+            <m:sup>
+              <m:r>
+                <w:rPr>
+                  <w:rFonts w:ascii="Cambria Math" w:hAnsi="Cambria Math"/>
+                </w:rPr>
+                <m:t>2</m:t>
+              </m:r>
+            </m:sup>
+          </m:sSup>
+          <m:sSub>
+            <m:sSubPr>
+              <m:ctrlPr>
+                <w:rPr>
+                  <w:rFonts w:ascii="Cambria Math" w:hAnsi="Cambria Math"/>
+                  <w:i/>
+                </w:rPr>
+              </m:ctrlPr>
+            </m:sSubPr>
+            <m:e>
+              <m:r>
+                <w:rPr>
+                  <w:rFonts w:ascii="Cambria Math" w:hAnsi="Cambria Math"/>
+                </w:rPr>
+                <m:t>a</m:t>
+              </m:r>
+            </m:e>
+            <m:sub>
+              <m:r>
+                <w:rPr>
+                  <w:rFonts w:ascii="Cambria Math" w:hAnsi="Cambria Math"/>
+                </w:rPr>
+                <m:t>2</m:t>
+              </m:r>
+            </m:sub>
+          </m:sSub>
+          <m:sSup>
+            <m:sSupPr>
+              <m:ctrlPr>
+                <w:rPr>
+                  <w:rFonts w:ascii="Cambria Math" w:hAnsi="Cambria Math"/>
+                  <w:i/>
+                </w:rPr>
+              </m:ctrlPr>
+            </m:sSupPr>
+            <m:e>
+              <m:sSub>
+                <m:sSubPr>
+                  <m:ctrlPr>
+                    <w:rPr>
+                      <w:rFonts w:ascii="Cambria Math" w:hAnsi="Cambria Math"/>
+                      <w:i/>
+                    </w:rPr>
+                  </m:ctrlPr>
+                </m:sSubPr>
+                <m:e>
+                  <m:r>
+                    <w:rPr>
+                      <w:rFonts w:ascii="Cambria Math" w:hAnsi="Cambria Math"/>
+                    </w:rPr>
+                    <m:t>b</m:t>
+                  </m:r>
+                </m:e>
+                <m:sub>
+                  <m:r>
+                    <w:rPr>
+                      <w:rFonts w:ascii="Cambria Math" w:hAnsi="Cambria Math"/>
+                    </w:rPr>
+                    <m:t>1</m:t>
+                  </m:r>
+                </m:sub>
+              </m:sSub>
+            </m:e>
+            <m:sup>
+              <m:r>
+                <w:rPr>
+                  <w:rFonts w:ascii="Cambria Math" w:hAnsi="Cambria Math"/>
+                </w:rPr>
+                <m:t>2</m:t>
+              </m:r>
+            </m:sup>
+          </m:sSup>
+          <m:sSub>
+            <m:sSubPr>
+              <m:ctrlPr>
+                <w:rPr>
+                  <w:rFonts w:ascii="Cambria Math" w:hAnsi="Cambria Math"/>
+                  <w:i/>
+                </w:rPr>
+              </m:ctrlPr>
+            </m:sSubPr>
+            <m:e>
+              <m:r>
+                <w:rPr>
+                  <w:rFonts w:ascii="Cambria Math" w:hAnsi="Cambria Math"/>
+                </w:rPr>
+                <m:t>b</m:t>
+              </m:r>
+            </m:e>
+            <m:sub>
+              <m:r>
+                <w:rPr>
+                  <w:rFonts w:ascii="Cambria Math" w:hAnsi="Cambria Math"/>
+                </w:rPr>
+                <m:t>2</m:t>
+              </m:r>
+            </m:sub>
+          </m:sSub>
+          <m:r>
+            <w:rPr>
+              <w:rFonts w:ascii="Cambria Math" w:hAnsi="Cambria Math"/>
+            </w:rPr>
+            <m:t>+</m:t>
+          </m:r>
+          <m:sSub>
+            <m:sSubPr>
+              <m:ctrlPr>
+                <w:rPr>
+                  <w:rFonts w:ascii="Cambria Math" w:hAnsi="Cambria Math"/>
+                  <w:i/>
+                </w:rPr>
+              </m:ctrlPr>
+            </m:sSubPr>
+            <m:e>
+              <m:r>
+                <w:rPr>
+                  <w:rFonts w:ascii="Cambria Math" w:hAnsi="Cambria Math"/>
+                </w:rPr>
+                <m:t>3a</m:t>
+              </m:r>
+            </m:e>
+            <m:sub>
+              <m:r>
+                <w:rPr>
+                  <w:rFonts w:ascii="Cambria Math" w:hAnsi="Cambria Math"/>
+                </w:rPr>
+                <m:t>1</m:t>
+              </m:r>
+            </m:sub>
+          </m:sSub>
+          <m:sSup>
+            <m:sSupPr>
+              <m:ctrlPr>
+                <w:rPr>
+                  <w:rFonts w:ascii="Cambria Math" w:hAnsi="Cambria Math"/>
+                  <w:i/>
+                </w:rPr>
+              </m:ctrlPr>
+            </m:sSupPr>
+            <m:e>
+              <m:sSub>
+                <m:sSubPr>
+                  <m:ctrlPr>
+                    <w:rPr>
+                      <w:rFonts w:ascii="Cambria Math" w:hAnsi="Cambria Math"/>
+                      <w:i/>
+                    </w:rPr>
+                  </m:ctrlPr>
+                </m:sSubPr>
+                <m:e>
+                  <m:r>
+                    <w:rPr>
+                      <w:rFonts w:ascii="Cambria Math" w:hAnsi="Cambria Math"/>
+                    </w:rPr>
+                    <m:t>a</m:t>
+                  </m:r>
+                </m:e>
+                <m:sub>
+                  <m:r>
+                    <w:rPr>
+                      <w:rFonts w:ascii="Cambria Math" w:hAnsi="Cambria Math"/>
+                    </w:rPr>
+                    <m:t>2</m:t>
+                  </m:r>
+                </m:sub>
+              </m:sSub>
+            </m:e>
+            <m:sup>
+              <m:r>
+                <w:rPr>
+                  <w:rFonts w:ascii="Cambria Math" w:hAnsi="Cambria Math"/>
+                </w:rPr>
+                <m:t>2</m:t>
+              </m:r>
+            </m:sup>
+          </m:sSup>
+          <m:sSub>
+            <m:sSubPr>
+              <m:ctrlPr>
+                <w:rPr>
+                  <w:rFonts w:ascii="Cambria Math" w:hAnsi="Cambria Math"/>
+                  <w:i/>
+                </w:rPr>
+              </m:ctrlPr>
+            </m:sSubPr>
+            <m:e>
+              <m:r>
+                <w:rPr>
+                  <w:rFonts w:ascii="Cambria Math" w:hAnsi="Cambria Math"/>
+                </w:rPr>
+                <m:t>b</m:t>
+              </m:r>
+            </m:e>
+            <m:sub>
+              <m:r>
+                <w:rPr>
+                  <w:rFonts w:ascii="Cambria Math" w:hAnsi="Cambria Math"/>
+                </w:rPr>
+                <m:t>1</m:t>
+              </m:r>
+            </m:sub>
+          </m:sSub>
+          <m:sSup>
+            <m:sSupPr>
+              <m:ctrlPr>
+                <w:rPr>
+                  <w:rFonts w:ascii="Cambria Math" w:hAnsi="Cambria Math"/>
+                  <w:i/>
+                </w:rPr>
+              </m:ctrlPr>
+            </m:sSupPr>
+            <m:e>
+              <m:sSub>
+                <m:sSubPr>
+                  <m:ctrlPr>
+                    <w:rPr>
+                      <w:rFonts w:ascii="Cambria Math" w:hAnsi="Cambria Math"/>
+                      <w:i/>
+                    </w:rPr>
+                  </m:ctrlPr>
+                </m:sSubPr>
+                <m:e>
+                  <m:r>
+                    <w:rPr>
+                      <w:rFonts w:ascii="Cambria Math" w:hAnsi="Cambria Math"/>
+                    </w:rPr>
+                    <m:t>b</m:t>
+                  </m:r>
+                </m:e>
+                <m:sub>
+                  <m:r>
+                    <w:rPr>
+                      <w:rFonts w:ascii="Cambria Math" w:hAnsi="Cambria Math"/>
+                    </w:rPr>
+                    <m:t>2</m:t>
+                  </m:r>
+                </m:sub>
+              </m:sSub>
+            </m:e>
+            <m:sup>
+              <m:r>
+                <w:rPr>
+                  <w:rFonts w:ascii="Cambria Math" w:hAnsi="Cambria Math"/>
+                </w:rPr>
+                <m:t>2</m:t>
+              </m:r>
+            </m:sup>
+          </m:sSup>
+          <m:r>
+            <w:rPr>
+              <w:rFonts w:ascii="Cambria Math" w:hAnsi="Cambria Math"/>
+            </w:rPr>
+            <m:t>+</m:t>
+          </m:r>
+          <m:sSup>
+            <m:sSupPr>
+              <m:ctrlPr>
+                <w:rPr>
+                  <w:rFonts w:ascii="Cambria Math" w:hAnsi="Cambria Math"/>
+                  <w:i/>
+                </w:rPr>
+              </m:ctrlPr>
+            </m:sSupPr>
+            <m:e>
+              <m:sSub>
+                <m:sSubPr>
+                  <m:ctrlPr>
+                    <w:rPr>
+                      <w:rFonts w:ascii="Cambria Math" w:hAnsi="Cambria Math"/>
+                      <w:i/>
+                    </w:rPr>
+                  </m:ctrlPr>
+                </m:sSubPr>
+                <m:e>
+                  <m:r>
+                    <w:rPr>
+                      <w:rFonts w:ascii="Cambria Math" w:hAnsi="Cambria Math"/>
+                    </w:rPr>
+                    <m:t>a</m:t>
+                  </m:r>
+                </m:e>
+                <m:sub>
+                  <m:r>
+                    <w:rPr>
+                      <w:rFonts w:ascii="Cambria Math" w:hAnsi="Cambria Math"/>
+                    </w:rPr>
+                    <m:t>2</m:t>
+                  </m:r>
+                </m:sub>
+              </m:sSub>
+            </m:e>
+            <m:sup>
+              <m:r>
+                <w:rPr>
+                  <w:rFonts w:ascii="Cambria Math" w:hAnsi="Cambria Math"/>
+                </w:rPr>
+                <m:t>3</m:t>
+              </m:r>
+            </m:sup>
+          </m:sSup>
+          <m:sSup>
+            <m:sSupPr>
+              <m:ctrlPr>
+                <w:rPr>
+                  <w:rFonts w:ascii="Cambria Math" w:hAnsi="Cambria Math"/>
+                  <w:i/>
+                </w:rPr>
+              </m:ctrlPr>
+            </m:sSupPr>
+            <m:e>
+              <m:sSub>
+                <m:sSubPr>
+                  <m:ctrlPr>
+                    <w:rPr>
+                      <w:rFonts w:ascii="Cambria Math" w:hAnsi="Cambria Math"/>
+                      <w:i/>
+                    </w:rPr>
+                  </m:ctrlPr>
+                </m:sSubPr>
+                <m:e>
+                  <m:r>
+                    <w:rPr>
+                      <w:rFonts w:ascii="Cambria Math" w:hAnsi="Cambria Math"/>
+                    </w:rPr>
+                    <m:t>b</m:t>
+                  </m:r>
+                </m:e>
+                <m:sub>
+                  <m:r>
+                    <w:rPr>
+                      <w:rFonts w:ascii="Cambria Math" w:hAnsi="Cambria Math"/>
+                    </w:rPr>
+                    <m:t>2</m:t>
+                  </m:r>
+                </m:sub>
+              </m:sSub>
+            </m:e>
+            <m:sup>
+              <m:r>
+                <w:rPr>
+                  <w:rFonts w:ascii="Cambria Math" w:hAnsi="Cambria Math"/>
+                </w:rPr>
+                <m:t>3</m:t>
+              </m:r>
+            </m:sup>
+          </m:sSup>
+        </m:oMath>
+      </m:oMathPara>
+    </w:p>
+    <w:p>
+      <w:pPr>
+        <w:spacing w:line="334" w:lineRule="auto"/>
+      </w:pPr>
+      <m:oMathPara>
+        <m:oMathParaPr>
+          <m:jc m:val="left"/>
+        </m:oMathParaPr>
+        <m:oMath>
+          <m:d>
+            <m:dPr>
+              <m:ctrlPr>
+                <w:rPr>
+                  <w:rFonts w:ascii="Cambria Math" w:hAnsi="Cambria Math"/>
+                  <w:i/>
+                </w:rPr>
+              </m:ctrlPr>
+            </m:dPr>
+            <m:e>
+              <m:sSup>
+                <m:sSupPr>
+                  <m:ctrlPr>
+                    <w:rPr>
+                      <w:rFonts w:ascii="Cambria Math" w:hAnsi="Cambria Math"/>
+                      <w:i/>
+                    </w:rPr>
+                  </m:ctrlPr>
+                </m:sSupPr>
+                <m:e>
+                  <m:sSub>
+                    <m:sSubPr>
+                      <m:ctrlPr>
+                        <w:rPr>
+                          <w:rFonts w:ascii="Cambria Math" w:hAnsi="Cambria Math"/>
+                          <w:i/>
+                        </w:rPr>
+                      </m:ctrlPr>
+                    </m:sSubPr>
+                    <m:e>
+                      <m:r>
+                        <w:rPr>
+                          <w:rFonts w:ascii="Cambria Math" w:hAnsi="Cambria Math"/>
+                        </w:rPr>
+                        <m:t>a</m:t>
+                      </m:r>
+                    </m:e>
+                    <m:sub>
+                      <m:r>
+                        <w:rPr>
+                          <w:rFonts w:ascii="Cambria Math" w:hAnsi="Cambria Math"/>
+                        </w:rPr>
+                        <m:t>1</m:t>
+                      </m:r>
+                    </m:sub>
+                  </m:sSub>
+                </m:e>
+                <m:sup>
+                  <m:r>
+                    <w:rPr>
+                      <w:rFonts w:ascii="Cambria Math" w:hAnsi="Cambria Math"/>
+                    </w:rPr>
+                    <m:t>3</m:t>
+                  </m:r>
+                </m:sup>
+              </m:sSup>
+            </m:e>
+          </m:d>
+          <m:d>
+            <m:dPr>
+              <m:ctrlPr>
+                <w:rPr>
+                  <w:rFonts w:ascii="Cambria Math" w:hAnsi="Cambria Math"/>
+                  <w:i/>
+                </w:rPr>
+              </m:ctrlPr>
+            </m:dPr>
+            <m:e>
+              <m:sSup>
+                <m:sSupPr>
+                  <m:ctrlPr>
+                    <w:rPr>
+                      <w:rFonts w:ascii="Cambria Math" w:hAnsi="Cambria Math"/>
+                      <w:i/>
+                    </w:rPr>
+                  </m:ctrlPr>
+                </m:sSupPr>
+                <m:e>
+                  <m:sSub>
+                    <m:sSubPr>
+                      <m:ctrlPr>
+                        <w:rPr>
+                          <w:rFonts w:ascii="Cambria Math" w:hAnsi="Cambria Math"/>
+                          <w:i/>
+                        </w:rPr>
+                      </m:ctrlPr>
+                    </m:sSubPr>
+                    <m:e>
+                      <m:r>
+                        <w:rPr>
+                          <w:rFonts w:ascii="Cambria Math" w:hAnsi="Cambria Math"/>
+                        </w:rPr>
+                        <m:t>b</m:t>
+                      </m:r>
+                    </m:e>
+                    <m:sub>
+                      <m:r>
+                        <w:rPr>
+                          <w:rFonts w:ascii="Cambria Math" w:hAnsi="Cambria Math"/>
+                        </w:rPr>
+                        <m:t>1</m:t>
+                      </m:r>
+                    </m:sub>
+                  </m:sSub>
+                </m:e>
+                <m:sup>
+                  <m:r>
+                    <w:rPr>
+                      <w:rFonts w:ascii="Cambria Math" w:hAnsi="Cambria Math"/>
+                    </w:rPr>
+                    <m:t>3</m:t>
+                  </m:r>
+                </m:sup>
+              </m:sSup>
+            </m:e>
+          </m:d>
+          <m:r>
+            <w:rPr>
+              <w:rFonts w:ascii="Cambria Math" w:hAnsi="Cambria Math"/>
+            </w:rPr>
+            <m:t>+</m:t>
+          </m:r>
+          <m:d>
+            <m:dPr>
+              <m:ctrlPr>
+                <w:rPr>
+                  <w:rFonts w:ascii="Cambria Math" w:hAnsi="Cambria Math"/>
+                  <w:i/>
+                </w:rPr>
+              </m:ctrlPr>
+            </m:dPr>
+            <m:e>
+              <m:sSup>
+                <m:sSupPr>
+                  <m:ctrlPr>
+                    <w:rPr>
+                      <w:rFonts w:ascii="Cambria Math" w:hAnsi="Cambria Math"/>
+                      <w:i/>
+                    </w:rPr>
+                  </m:ctrlPr>
+                </m:sSupPr>
+                <m:e>
+                  <m:sSub>
+                    <m:sSubPr>
+                      <m:ctrlPr>
+                        <w:rPr>
+                          <w:rFonts w:ascii="Cambria Math" w:hAnsi="Cambria Math"/>
+                          <w:i/>
+                        </w:rPr>
+                      </m:ctrlPr>
+                    </m:sSubPr>
+                    <m:e>
+                      <m:rad>
+                        <m:radPr>
+                          <m:degHide m:val="1"/>
+                          <m:ctrlPr>
+                            <w:rPr>
+                              <w:rFonts w:ascii="Cambria Math" w:hAnsi="Cambria Math"/>
+                              <w:i/>
+                            </w:rPr>
+                          </m:ctrlPr>
+                        </m:radPr>
+                        <m:deg/>
+                        <m:e>
+                          <m:r>
+                            <w:rPr>
+                              <w:rFonts w:ascii="Cambria Math" w:hAnsi="Cambria Math"/>
+                            </w:rPr>
+                            <m:t>3</m:t>
+                          </m:r>
+                        </m:e>
+                      </m:rad>
+                      <m:r>
+                        <w:rPr>
+                          <w:rFonts w:ascii="Cambria Math" w:hAnsi="Cambria Math"/>
+                        </w:rPr>
+                        <m:t>a</m:t>
+                      </m:r>
+                    </m:e>
+                    <m:sub>
+                      <m:r>
+                        <w:rPr>
+                          <w:rFonts w:ascii="Cambria Math" w:hAnsi="Cambria Math"/>
+                        </w:rPr>
+                        <m:t>1</m:t>
+                      </m:r>
+                    </m:sub>
+                  </m:sSub>
+                </m:e>
+                <m:sup>
+                  <m:r>
+                    <w:rPr>
+                      <w:rFonts w:ascii="Cambria Math" w:hAnsi="Cambria Math"/>
+                    </w:rPr>
+                    <m:t>2</m:t>
+                  </m:r>
+                </m:sup>
+              </m:sSup>
+              <m:sSub>
+                <m:sSubPr>
+                  <m:ctrlPr>
+                    <w:rPr>
+                      <w:rFonts w:ascii="Cambria Math" w:hAnsi="Cambria Math"/>
+                      <w:i/>
+                    </w:rPr>
+                  </m:ctrlPr>
+                </m:sSubPr>
+                <m:e>
+                  <m:r>
+                    <w:rPr>
+                      <w:rFonts w:ascii="Cambria Math" w:hAnsi="Cambria Math"/>
+                    </w:rPr>
+                    <m:t>a</m:t>
+                  </m:r>
+                </m:e>
+                <m:sub>
+                  <m:r>
+                    <w:rPr>
+                      <w:rFonts w:ascii="Cambria Math" w:hAnsi="Cambria Math"/>
+                    </w:rPr>
+                    <m:t>2</m:t>
+                  </m:r>
+                </m:sub>
+              </m:sSub>
+            </m:e>
+          </m:d>
+          <m:d>
+            <m:dPr>
+              <m:ctrlPr>
+                <w:rPr>
+                  <w:rFonts w:ascii="Cambria Math" w:hAnsi="Cambria Math"/>
+                  <w:i/>
+                </w:rPr>
+              </m:ctrlPr>
+            </m:dPr>
+            <m:e>
+              <m:sSup>
+                <m:sSupPr>
+                  <m:ctrlPr>
+                    <w:rPr>
+                      <w:rFonts w:ascii="Cambria Math" w:hAnsi="Cambria Math"/>
+                      <w:i/>
+                    </w:rPr>
+                  </m:ctrlPr>
+                </m:sSupPr>
+                <m:e>
+                  <m:sSub>
+                    <m:sSubPr>
+                      <m:ctrlPr>
+                        <w:rPr>
+                          <w:rFonts w:ascii="Cambria Math" w:hAnsi="Cambria Math"/>
+                          <w:i/>
+                        </w:rPr>
+                      </m:ctrlPr>
+                    </m:sSubPr>
+                    <m:e>
+                      <m:rad>
+                        <m:radPr>
+                          <m:degHide m:val="1"/>
+                          <m:ctrlPr>
+                            <w:rPr>
+                              <w:rFonts w:ascii="Cambria Math" w:hAnsi="Cambria Math"/>
+                              <w:i/>
+                            </w:rPr>
+                          </m:ctrlPr>
+                        </m:radPr>
+                        <m:deg/>
+                        <m:e>
+                          <m:r>
+                            <w:rPr>
+                              <w:rFonts w:ascii="Cambria Math" w:hAnsi="Cambria Math"/>
+                            </w:rPr>
+                            <m:t>3</m:t>
+                          </m:r>
+                        </m:e>
+                      </m:rad>
+                      <m:r>
+                        <w:rPr>
+                          <w:rFonts w:ascii="Cambria Math" w:hAnsi="Cambria Math"/>
+                        </w:rPr>
+                        <m:t>b</m:t>
+                      </m:r>
+                    </m:e>
+                    <m:sub>
+                      <m:r>
+                        <w:rPr>
+                          <w:rFonts w:ascii="Cambria Math" w:hAnsi="Cambria Math"/>
+                        </w:rPr>
+                        <m:t>1</m:t>
+                      </m:r>
+                    </m:sub>
+                  </m:sSub>
+                </m:e>
+                <m:sup>
+                  <m:r>
+                    <w:rPr>
+                      <w:rFonts w:ascii="Cambria Math" w:hAnsi="Cambria Math"/>
+                    </w:rPr>
+                    <m:t>2</m:t>
+                  </m:r>
+                </m:sup>
+              </m:sSup>
+              <m:sSub>
+                <m:sSubPr>
+                  <m:ctrlPr>
+                    <w:rPr>
+                      <w:rFonts w:ascii="Cambria Math" w:hAnsi="Cambria Math"/>
+                      <w:i/>
+                    </w:rPr>
+                  </m:ctrlPr>
+                </m:sSubPr>
+                <m:e>
+                  <m:r>
+                    <w:rPr>
+                      <w:rFonts w:ascii="Cambria Math" w:hAnsi="Cambria Math"/>
+                    </w:rPr>
+                    <m:t>b</m:t>
+                  </m:r>
+                </m:e>
+                <m:sub>
+                  <m:r>
+                    <w:rPr>
+                      <w:rFonts w:ascii="Cambria Math" w:hAnsi="Cambria Math"/>
+                    </w:rPr>
+                    <m:t>2</m:t>
+                  </m:r>
+                </m:sub>
+              </m:sSub>
+            </m:e>
+          </m:d>
+          <m:r>
+            <w:rPr>
+              <w:rFonts w:ascii="Cambria Math" w:hAnsi="Cambria Math"/>
+            </w:rPr>
+            <m:t>+</m:t>
+          </m:r>
+          <m:d>
+            <m:dPr>
+              <m:ctrlPr>
+                <w:rPr>
+                  <w:rFonts w:ascii="Cambria Math" w:hAnsi="Cambria Math"/>
+                  <w:i/>
+                </w:rPr>
+              </m:ctrlPr>
+            </m:dPr>
+            <m:e>
+              <m:sSub>
+                <m:sSubPr>
+                  <m:ctrlPr>
+                    <w:rPr>
+                      <w:rFonts w:ascii="Cambria Math" w:hAnsi="Cambria Math"/>
+                      <w:i/>
+                    </w:rPr>
+                  </m:ctrlPr>
+                </m:sSubPr>
+                <m:e>
+                  <m:rad>
+                    <m:radPr>
+                      <m:degHide m:val="1"/>
+                      <m:ctrlPr>
+                        <w:rPr>
+                          <w:rFonts w:ascii="Cambria Math" w:hAnsi="Cambria Math"/>
+                          <w:i/>
+                        </w:rPr>
+                      </m:ctrlPr>
+                    </m:radPr>
+                    <m:deg/>
+                    <m:e>
+                      <m:r>
+                        <w:rPr>
+                          <w:rFonts w:ascii="Cambria Math" w:hAnsi="Cambria Math"/>
+                        </w:rPr>
+                        <m:t>3</m:t>
+                      </m:r>
+                    </m:e>
+                  </m:rad>
+                  <m:r>
+                    <w:rPr>
+                      <w:rFonts w:ascii="Cambria Math" w:hAnsi="Cambria Math"/>
+                    </w:rPr>
+                    <m:t>a</m:t>
+                  </m:r>
+                </m:e>
+                <m:sub>
+                  <m:r>
+                    <w:rPr>
+                      <w:rFonts w:ascii="Cambria Math" w:hAnsi="Cambria Math"/>
+                    </w:rPr>
+                    <m:t>1</m:t>
+                  </m:r>
+                </m:sub>
+              </m:sSub>
+              <m:sSup>
+                <m:sSupPr>
+                  <m:ctrlPr>
+                    <w:rPr>
+                      <w:rFonts w:ascii="Cambria Math" w:hAnsi="Cambria Math"/>
+                      <w:i/>
+                    </w:rPr>
+                  </m:ctrlPr>
+                </m:sSupPr>
+                <m:e>
+                  <m:sSub>
+                    <m:sSubPr>
+                      <m:ctrlPr>
+                        <w:rPr>
+                          <w:rFonts w:ascii="Cambria Math" w:hAnsi="Cambria Math"/>
+                          <w:i/>
+                        </w:rPr>
+                      </m:ctrlPr>
+                    </m:sSubPr>
+                    <m:e>
+                      <m:r>
+                        <w:rPr>
+                          <w:rFonts w:ascii="Cambria Math" w:hAnsi="Cambria Math"/>
+                        </w:rPr>
+                        <m:t>a</m:t>
+                      </m:r>
+                    </m:e>
+                    <m:sub>
+                      <m:r>
+                        <w:rPr>
+                          <w:rFonts w:ascii="Cambria Math" w:hAnsi="Cambria Math"/>
+                        </w:rPr>
+                        <m:t>2</m:t>
+                      </m:r>
+                    </m:sub>
+                  </m:sSub>
+                </m:e>
+                <m:sup>
+                  <m:r>
+                    <w:rPr>
+                      <w:rFonts w:ascii="Cambria Math" w:hAnsi="Cambria Math"/>
+                    </w:rPr>
+                    <m:t>2</m:t>
+                  </m:r>
+                </m:sup>
+              </m:sSup>
+            </m:e>
+          </m:d>
+          <m:d>
+            <m:dPr>
+              <m:ctrlPr>
+                <w:rPr>
+                  <w:rFonts w:ascii="Cambria Math" w:hAnsi="Cambria Math"/>
+                  <w:i/>
+                </w:rPr>
+              </m:ctrlPr>
+            </m:dPr>
+            <m:e>
+              <m:sSub>
+                <m:sSubPr>
+                  <m:ctrlPr>
+                    <w:rPr>
+                      <w:rFonts w:ascii="Cambria Math" w:hAnsi="Cambria Math"/>
+                      <w:i/>
+                    </w:rPr>
+                  </m:ctrlPr>
+                </m:sSubPr>
+                <m:e>
+                  <m:rad>
+                    <m:radPr>
+                      <m:degHide m:val="1"/>
+                      <m:ctrlPr>
+                        <w:rPr>
+                          <w:rFonts w:ascii="Cambria Math" w:hAnsi="Cambria Math"/>
+                          <w:i/>
+                        </w:rPr>
+                      </m:ctrlPr>
+                    </m:radPr>
+                    <m:deg/>
+                    <m:e>
+                      <m:r>
+                        <w:rPr>
+                          <w:rFonts w:ascii="Cambria Math" w:hAnsi="Cambria Math"/>
+                        </w:rPr>
+                        <m:t>3</m:t>
+                      </m:r>
+                    </m:e>
+                  </m:rad>
+                  <m:r>
+                    <w:rPr>
+                      <w:rFonts w:ascii="Cambria Math" w:hAnsi="Cambria Math"/>
+                    </w:rPr>
+                    <m:t>b</m:t>
+                  </m:r>
+                </m:e>
+                <m:sub>
+                  <m:r>
+                    <w:rPr>
+                      <w:rFonts w:ascii="Cambria Math" w:hAnsi="Cambria Math"/>
+                    </w:rPr>
+                    <m:t>1</m:t>
+                  </m:r>
+                </m:sub>
+              </m:sSub>
+              <m:sSup>
+                <m:sSupPr>
+                  <m:ctrlPr>
+                    <w:rPr>
+                      <w:rFonts w:ascii="Cambria Math" w:hAnsi="Cambria Math"/>
+                      <w:i/>
+                    </w:rPr>
+                  </m:ctrlPr>
+                </m:sSupPr>
+                <m:e>
+                  <m:sSub>
+                    <m:sSubPr>
+                      <m:ctrlPr>
+                        <w:rPr>
+                          <w:rFonts w:ascii="Cambria Math" w:hAnsi="Cambria Math"/>
+                          <w:i/>
+                        </w:rPr>
+                      </m:ctrlPr>
+                    </m:sSubPr>
+                    <m:e>
+                      <m:r>
+                        <w:rPr>
+                          <w:rFonts w:ascii="Cambria Math" w:hAnsi="Cambria Math"/>
+                        </w:rPr>
+                        <m:t>b</m:t>
+                      </m:r>
+                    </m:e>
+                    <m:sub>
+                      <m:r>
+                        <w:rPr>
+                          <w:rFonts w:ascii="Cambria Math" w:hAnsi="Cambria Math"/>
+                        </w:rPr>
+                        <m:t>2</m:t>
+                      </m:r>
+                    </m:sub>
+                  </m:sSub>
+                </m:e>
+                <m:sup>
+                  <m:r>
+                    <w:rPr>
+                      <w:rFonts w:ascii="Cambria Math" w:hAnsi="Cambria Math"/>
+                    </w:rPr>
+                    <m:t>2</m:t>
+                  </m:r>
+                </m:sup>
+              </m:sSup>
+            </m:e>
+          </m:d>
+          <m:r>
+            <w:rPr>
+              <w:rFonts w:ascii="Cambria Math" w:hAnsi="Cambria Math"/>
+            </w:rPr>
+            <m:t>+</m:t>
+          </m:r>
+          <m:d>
+            <m:dPr>
+              <m:ctrlPr>
+                <w:rPr>
+                  <w:rFonts w:ascii="Cambria Math" w:hAnsi="Cambria Math"/>
+                  <w:i/>
+                </w:rPr>
+              </m:ctrlPr>
+            </m:dPr>
+            <m:e>
+              <m:sSup>
+                <m:sSupPr>
+                  <m:ctrlPr>
+                    <w:rPr>
+                      <w:rFonts w:ascii="Cambria Math" w:hAnsi="Cambria Math"/>
+                      <w:i/>
+                    </w:rPr>
+                  </m:ctrlPr>
+                </m:sSupPr>
+                <m:e>
+                  <m:sSub>
+                    <m:sSubPr>
+                      <m:ctrlPr>
+                        <w:rPr>
+                          <w:rFonts w:ascii="Cambria Math" w:hAnsi="Cambria Math"/>
+                          <w:i/>
+                        </w:rPr>
+                      </m:ctrlPr>
+                    </m:sSubPr>
+                    <m:e>
+                      <m:r>
+                        <w:rPr>
+                          <w:rFonts w:ascii="Cambria Math" w:hAnsi="Cambria Math"/>
+                        </w:rPr>
+                        <m:t>a</m:t>
+                      </m:r>
+                    </m:e>
+                    <m:sub>
+                      <m:r>
+                        <w:rPr>
+                          <w:rFonts w:ascii="Cambria Math" w:hAnsi="Cambria Math"/>
+                        </w:rPr>
+                        <m:t>2</m:t>
+                      </m:r>
+                    </m:sub>
+                  </m:sSub>
+                </m:e>
+                <m:sup>
+                  <m:r>
+                    <w:rPr>
+                      <w:rFonts w:ascii="Cambria Math" w:hAnsi="Cambria Math"/>
+                    </w:rPr>
+                    <m:t>3</m:t>
+                  </m:r>
+                </m:sup>
+              </m:sSup>
+            </m:e>
+          </m:d>
+          <m:d>
+            <m:dPr>
+              <m:ctrlPr>
+                <w:rPr>
+                  <w:rFonts w:ascii="Cambria Math" w:hAnsi="Cambria Math"/>
+                  <w:i/>
+                </w:rPr>
+              </m:ctrlPr>
+            </m:dPr>
+            <m:e>
+              <m:sSup>
+                <m:sSupPr>
+                  <m:ctrlPr>
+                    <w:rPr>
+                      <w:rFonts w:ascii="Cambria Math" w:hAnsi="Cambria Math"/>
+                      <w:i/>
+                    </w:rPr>
+                  </m:ctrlPr>
+                </m:sSupPr>
+                <m:e>
+                  <m:sSub>
+                    <m:sSubPr>
+                      <m:ctrlPr>
+                        <w:rPr>
+                          <w:rFonts w:ascii="Cambria Math" w:hAnsi="Cambria Math"/>
+                          <w:i/>
+                        </w:rPr>
+                      </m:ctrlPr>
+                    </m:sSubPr>
+                    <m:e>
+                      <m:r>
+                        <w:rPr>
+                          <w:rFonts w:ascii="Cambria Math" w:hAnsi="Cambria Math"/>
+                        </w:rPr>
+                        <m:t>b</m:t>
+                      </m:r>
+                    </m:e>
+                    <m:sub>
+                      <m:r>
+                        <w:rPr>
+                          <w:rFonts w:ascii="Cambria Math" w:hAnsi="Cambria Math"/>
+                        </w:rPr>
+                        <m:t>2</m:t>
+                      </m:r>
+                    </m:sub>
+                  </m:sSub>
+                </m:e>
+                <m:sup>
+                  <m:r>
+                    <w:rPr>
+                      <w:rFonts w:ascii="Cambria Math" w:hAnsi="Cambria Math"/>
+                    </w:rPr>
+                    <m:t>3</m:t>
+                  </m:r>
+                </m:sup>
+              </m:sSup>
+            </m:e>
+          </m:d>
+        </m:oMath>
+      </m:oMathPara>
+    </w:p>
+    <w:p>
+      <w:pPr>
+        <w:spacing w:line="334" w:lineRule="auto"/>
+      </w:pPr>
+      <w:r>
+        <w:t>So:</w:t>
+      </w:r>
+    </w:p>
+    <w:p>
+      <w:pPr>
+        <w:spacing w:line="334" w:lineRule="auto"/>
+      </w:pPr>
+      <m:oMathPara>
+        <m:oMathParaPr>
+          <m:jc m:val="left"/>
+        </m:oMathParaPr>
+        <m:oMath>
+          <m:r>
+            <w:rPr>
+              <w:rFonts w:ascii="Cambria Math" w:hAnsi="Cambria Math"/>
+            </w:rPr>
+            <m:t>φ</m:t>
+          </m:r>
+          <m:d>
+            <m:dPr>
+              <m:ctrlPr>
+                <w:rPr>
+                  <w:rFonts w:ascii="Cambria Math" w:hAnsi="Cambria Math"/>
+                  <w:i/>
+                </w:rPr>
+              </m:ctrlPr>
+            </m:dPr>
+            <m:e>
+              <m:r>
+                <w:rPr>
+                  <w:rFonts w:ascii="Cambria Math" w:hAnsi="Cambria Math"/>
+                </w:rPr>
+                <m:t>a</m:t>
+              </m:r>
+            </m:e>
+          </m:d>
+          <m:r>
+            <w:rPr>
+              <w:rFonts w:ascii="Cambria Math" w:hAnsi="Cambria Math"/>
+            </w:rPr>
+            <m:t>=</m:t>
+          </m:r>
+          <m:r>
+            <w:rPr>
+              <w:rFonts w:ascii="Cambria Math" w:hAnsi="Cambria Math"/>
+            </w:rPr>
+            <m:t xml:space="preserve"> </m:t>
+          </m:r>
+          <m:d>
+            <m:dPr>
+              <m:begChr m:val="["/>
+              <m:endChr m:val="]"/>
+              <m:ctrlPr>
+                <w:rPr>
+                  <w:rFonts w:ascii="Cambria Math" w:hAnsi="Cambria Math"/>
+                  <w:i/>
+                </w:rPr>
+              </m:ctrlPr>
+            </m:dPr>
+            <m:e>
+              <m:sSup>
+                <m:sSupPr>
+                  <m:ctrlPr>
+                    <w:rPr>
+                      <w:rFonts w:ascii="Cambria Math" w:hAnsi="Cambria Math"/>
+                      <w:i/>
+                    </w:rPr>
+                  </m:ctrlPr>
+                </m:sSupPr>
+                <m:e>
+                  <m:sSub>
+                    <m:sSubPr>
+                      <m:ctrlPr>
+                        <w:rPr>
+                          <w:rFonts w:ascii="Cambria Math" w:hAnsi="Cambria Math"/>
+                          <w:i/>
+                        </w:rPr>
+                      </m:ctrlPr>
+                    </m:sSubPr>
+                    <m:e>
+                      <m:r>
+                        <w:rPr>
+                          <w:rFonts w:ascii="Cambria Math" w:hAnsi="Cambria Math"/>
+                        </w:rPr>
+                        <m:t>a</m:t>
+                      </m:r>
+                    </m:e>
+                    <m:sub>
+                      <m:r>
+                        <w:rPr>
+                          <w:rFonts w:ascii="Cambria Math" w:hAnsi="Cambria Math"/>
+                        </w:rPr>
+                        <m:t>1</m:t>
+                      </m:r>
+                    </m:sub>
+                  </m:sSub>
+                </m:e>
+                <m:sup>
+                  <m:r>
+                    <w:rPr>
+                      <w:rFonts w:ascii="Cambria Math" w:hAnsi="Cambria Math"/>
+                    </w:rPr>
+                    <m:t>3</m:t>
+                  </m:r>
+                </m:sup>
+              </m:sSup>
+              <m:r>
+                <w:rPr>
+                  <w:rFonts w:ascii="Cambria Math" w:hAnsi="Cambria Math"/>
+                </w:rPr>
+                <m:t>,</m:t>
+              </m:r>
+              <m:sSup>
+                <m:sSupPr>
+                  <m:ctrlPr>
+                    <w:rPr>
+                      <w:rFonts w:ascii="Cambria Math" w:hAnsi="Cambria Math"/>
+                      <w:i/>
+                    </w:rPr>
+                  </m:ctrlPr>
+                </m:sSupPr>
+                <m:e>
+                  <m:sSub>
+                    <m:sSubPr>
+                      <m:ctrlPr>
+                        <w:rPr>
+                          <w:rFonts w:ascii="Cambria Math" w:hAnsi="Cambria Math"/>
+                          <w:i/>
+                        </w:rPr>
+                      </m:ctrlPr>
+                    </m:sSubPr>
+                    <m:e>
+                      <m:rad>
+                        <m:radPr>
+                          <m:degHide m:val="1"/>
+                          <m:ctrlPr>
+                            <w:rPr>
+                              <w:rFonts w:ascii="Cambria Math" w:hAnsi="Cambria Math"/>
+                              <w:i/>
+                            </w:rPr>
+                          </m:ctrlPr>
+                        </m:radPr>
+                        <m:deg/>
+                        <m:e>
+                          <m:r>
+                            <w:rPr>
+                              <w:rFonts w:ascii="Cambria Math" w:hAnsi="Cambria Math"/>
+                            </w:rPr>
+                            <m:t>3</m:t>
+                          </m:r>
+                        </m:e>
+                      </m:rad>
+                      <m:r>
+                        <w:rPr>
+                          <w:rFonts w:ascii="Cambria Math" w:hAnsi="Cambria Math"/>
+                        </w:rPr>
+                        <m:t>a</m:t>
+                      </m:r>
+                    </m:e>
+                    <m:sub>
+                      <m:r>
+                        <w:rPr>
+                          <w:rFonts w:ascii="Cambria Math" w:hAnsi="Cambria Math"/>
+                        </w:rPr>
+                        <m:t>1</m:t>
+                      </m:r>
+                    </m:sub>
+                  </m:sSub>
+                </m:e>
+                <m:sup>
+                  <m:r>
+                    <w:rPr>
+                      <w:rFonts w:ascii="Cambria Math" w:hAnsi="Cambria Math"/>
+                    </w:rPr>
+                    <m:t>2</m:t>
+                  </m:r>
+                </m:sup>
+              </m:sSup>
+              <m:sSub>
+                <m:sSubPr>
+                  <m:ctrlPr>
+                    <w:rPr>
+                      <w:rFonts w:ascii="Cambria Math" w:hAnsi="Cambria Math"/>
+                      <w:i/>
+                    </w:rPr>
+                  </m:ctrlPr>
+                </m:sSubPr>
+                <m:e>
+                  <m:r>
+                    <w:rPr>
+                      <w:rFonts w:ascii="Cambria Math" w:hAnsi="Cambria Math"/>
+                    </w:rPr>
+                    <m:t>a</m:t>
+                  </m:r>
+                </m:e>
+                <m:sub>
+                  <m:r>
+                    <w:rPr>
+                      <w:rFonts w:ascii="Cambria Math" w:hAnsi="Cambria Math"/>
+                    </w:rPr>
+                    <m:t>2</m:t>
+                  </m:r>
+                </m:sub>
+              </m:sSub>
+              <m:r>
+                <w:rPr>
+                  <w:rFonts w:ascii="Cambria Math" w:hAnsi="Cambria Math"/>
+                </w:rPr>
+                <m:t>,</m:t>
+              </m:r>
+              <m:sSub>
+                <m:sSubPr>
+                  <m:ctrlPr>
+                    <w:rPr>
+                      <w:rFonts w:ascii="Cambria Math" w:hAnsi="Cambria Math"/>
+                      <w:i/>
+                    </w:rPr>
+                  </m:ctrlPr>
+                </m:sSubPr>
+                <m:e>
+                  <m:rad>
+                    <m:radPr>
+                      <m:degHide m:val="1"/>
+                      <m:ctrlPr>
+                        <w:rPr>
+                          <w:rFonts w:ascii="Cambria Math" w:hAnsi="Cambria Math"/>
+                          <w:i/>
+                        </w:rPr>
+                      </m:ctrlPr>
+                    </m:radPr>
+                    <m:deg/>
+                    <m:e>
+                      <m:r>
+                        <w:rPr>
+                          <w:rFonts w:ascii="Cambria Math" w:hAnsi="Cambria Math"/>
+                        </w:rPr>
+                        <m:t>3</m:t>
+                      </m:r>
+                    </m:e>
+                  </m:rad>
+                  <m:r>
+                    <w:rPr>
+                      <w:rFonts w:ascii="Cambria Math" w:hAnsi="Cambria Math"/>
+                    </w:rPr>
+                    <m:t>a</m:t>
+                  </m:r>
+                </m:e>
+                <m:sub>
+                  <m:r>
+                    <w:rPr>
+                      <w:rFonts w:ascii="Cambria Math" w:hAnsi="Cambria Math"/>
+                    </w:rPr>
+                    <m:t>1</m:t>
+                  </m:r>
+                </m:sub>
+              </m:sSub>
+              <m:sSup>
+                <m:sSupPr>
+                  <m:ctrlPr>
+                    <w:rPr>
+                      <w:rFonts w:ascii="Cambria Math" w:hAnsi="Cambria Math"/>
+                      <w:i/>
+                    </w:rPr>
+                  </m:ctrlPr>
+                </m:sSupPr>
+                <m:e>
+                  <m:sSub>
+                    <m:sSubPr>
+                      <m:ctrlPr>
+                        <w:rPr>
+                          <w:rFonts w:ascii="Cambria Math" w:hAnsi="Cambria Math"/>
+                          <w:i/>
+                        </w:rPr>
+                      </m:ctrlPr>
+                    </m:sSubPr>
+                    <m:e>
+                      <m:r>
+                        <w:rPr>
+                          <w:rFonts w:ascii="Cambria Math" w:hAnsi="Cambria Math"/>
+                        </w:rPr>
+                        <m:t>a</m:t>
+                      </m:r>
+                    </m:e>
+                    <m:sub>
+                      <m:r>
+                        <w:rPr>
+                          <w:rFonts w:ascii="Cambria Math" w:hAnsi="Cambria Math"/>
+                        </w:rPr>
+                        <m:t>2</m:t>
+                      </m:r>
+                    </m:sub>
+                  </m:sSub>
+                </m:e>
+                <m:sup>
+                  <m:r>
+                    <w:rPr>
+                      <w:rFonts w:ascii="Cambria Math" w:hAnsi="Cambria Math"/>
+                    </w:rPr>
+                    <m:t>2</m:t>
+                  </m:r>
+                </m:sup>
+              </m:sSup>
+              <m:r>
+                <w:rPr>
+                  <w:rFonts w:ascii="Cambria Math" w:hAnsi="Cambria Math"/>
+                </w:rPr>
+                <m:t>,</m:t>
+              </m:r>
+              <m:sSup>
+                <m:sSupPr>
+                  <m:ctrlPr>
+                    <w:rPr>
+                      <w:rFonts w:ascii="Cambria Math" w:hAnsi="Cambria Math"/>
+                      <w:i/>
+                    </w:rPr>
+                  </m:ctrlPr>
+                </m:sSupPr>
+                <m:e>
+                  <m:sSub>
+                    <m:sSubPr>
+                      <m:ctrlPr>
+                        <w:rPr>
+                          <w:rFonts w:ascii="Cambria Math" w:hAnsi="Cambria Math"/>
+                          <w:i/>
+                        </w:rPr>
+                      </m:ctrlPr>
+                    </m:sSubPr>
+                    <m:e>
+                      <m:r>
+                        <w:rPr>
+                          <w:rFonts w:ascii="Cambria Math" w:hAnsi="Cambria Math"/>
+                        </w:rPr>
+                        <m:t>a</m:t>
+                      </m:r>
+                    </m:e>
+                    <m:sub>
+                      <m:r>
+                        <w:rPr>
+                          <w:rFonts w:ascii="Cambria Math" w:hAnsi="Cambria Math"/>
+                        </w:rPr>
+                        <m:t>2</m:t>
+                      </m:r>
+                    </m:sub>
+                  </m:sSub>
+                </m:e>
+                <m:sup>
+                  <m:r>
+                    <w:rPr>
+                      <w:rFonts w:ascii="Cambria Math" w:hAnsi="Cambria Math"/>
+                    </w:rPr>
+                    <m:t>3</m:t>
+                  </m:r>
+                </m:sup>
+              </m:sSup>
+            </m:e>
+          </m:d>
+        </m:oMath>
+      </m:oMathPara>
+    </w:p>
+    <w:p>
+      <w:pPr>
+        <w:spacing w:line="334" w:lineRule="auto"/>
+      </w:pPr>
+      <m:oMathPara>
+        <m:oMathParaPr>
+          <m:jc m:val="left"/>
+        </m:oMathParaPr>
+        <m:oMath>
+          <m:r>
+            <w:rPr>
+              <w:rFonts w:ascii="Cambria Math" w:hAnsi="Cambria Math"/>
+            </w:rPr>
+            <m:t>φ</m:t>
+          </m:r>
+          <m:d>
+            <m:dPr>
+              <m:ctrlPr>
+                <w:rPr>
+                  <w:rFonts w:ascii="Cambria Math" w:hAnsi="Cambria Math"/>
+                  <w:i/>
+                </w:rPr>
+              </m:ctrlPr>
+            </m:dPr>
+            <m:e>
+              <m:r>
+                <w:rPr>
+                  <w:rFonts w:ascii="Cambria Math" w:hAnsi="Cambria Math"/>
+                </w:rPr>
+                <m:t>b</m:t>
+              </m:r>
+            </m:e>
+          </m:d>
+          <m:r>
+            <w:rPr>
+              <w:rFonts w:ascii="Cambria Math" w:hAnsi="Cambria Math"/>
+            </w:rPr>
+            <m:t xml:space="preserve">= </m:t>
+          </m:r>
+          <m:d>
+            <m:dPr>
+              <m:begChr m:val="["/>
+              <m:endChr m:val="]"/>
+              <m:ctrlPr>
+                <w:rPr>
+                  <w:rFonts w:ascii="Cambria Math" w:hAnsi="Cambria Math"/>
+                  <w:i/>
+                </w:rPr>
+              </m:ctrlPr>
+            </m:dPr>
+            <m:e>
+              <m:sSup>
+                <m:sSupPr>
+                  <m:ctrlPr>
+                    <w:rPr>
+                      <w:rFonts w:ascii="Cambria Math" w:hAnsi="Cambria Math"/>
+                      <w:i/>
+                    </w:rPr>
+                  </m:ctrlPr>
+                </m:sSupPr>
+                <m:e>
+                  <m:sSub>
+                    <m:sSubPr>
+                      <m:ctrlPr>
+                        <w:rPr>
+                          <w:rFonts w:ascii="Cambria Math" w:hAnsi="Cambria Math"/>
+                          <w:i/>
+                        </w:rPr>
+                      </m:ctrlPr>
+                    </m:sSubPr>
+                    <m:e>
+                      <m:r>
+                        <w:rPr>
+                          <w:rFonts w:ascii="Cambria Math" w:hAnsi="Cambria Math"/>
+                        </w:rPr>
+                        <m:t>b</m:t>
+                      </m:r>
+                    </m:e>
+                    <m:sub>
+                      <m:r>
+                        <w:rPr>
+                          <w:rFonts w:ascii="Cambria Math" w:hAnsi="Cambria Math"/>
+                        </w:rPr>
+                        <m:t>1</m:t>
+                      </m:r>
+                    </m:sub>
+                  </m:sSub>
+                </m:e>
+                <m:sup>
+                  <m:r>
+                    <w:rPr>
+                      <w:rFonts w:ascii="Cambria Math" w:hAnsi="Cambria Math"/>
+                    </w:rPr>
+                    <m:t>3</m:t>
+                  </m:r>
+                </m:sup>
+              </m:sSup>
+              <m:r>
+                <w:rPr>
+                  <w:rFonts w:ascii="Cambria Math" w:hAnsi="Cambria Math"/>
+                </w:rPr>
+                <m:t>,</m:t>
+              </m:r>
+              <m:sSup>
+                <m:sSupPr>
+                  <m:ctrlPr>
+                    <w:rPr>
+                      <w:rFonts w:ascii="Cambria Math" w:hAnsi="Cambria Math"/>
+                      <w:i/>
+                    </w:rPr>
+                  </m:ctrlPr>
+                </m:sSupPr>
+                <m:e>
+                  <m:sSub>
+                    <m:sSubPr>
+                      <m:ctrlPr>
+                        <w:rPr>
+                          <w:rFonts w:ascii="Cambria Math" w:hAnsi="Cambria Math"/>
+                          <w:i/>
+                        </w:rPr>
+                      </m:ctrlPr>
+                    </m:sSubPr>
+                    <m:e>
+                      <m:rad>
+                        <m:radPr>
+                          <m:degHide m:val="1"/>
+                          <m:ctrlPr>
+                            <w:rPr>
+                              <w:rFonts w:ascii="Cambria Math" w:hAnsi="Cambria Math"/>
+                              <w:i/>
+                            </w:rPr>
+                          </m:ctrlPr>
+                        </m:radPr>
+                        <m:deg/>
+                        <m:e>
+                          <m:r>
+                            <w:rPr>
+                              <w:rFonts w:ascii="Cambria Math" w:hAnsi="Cambria Math"/>
+                            </w:rPr>
+                            <m:t>3</m:t>
+                          </m:r>
+                        </m:e>
+                      </m:rad>
+                      <m:r>
+                        <w:rPr>
+                          <w:rFonts w:ascii="Cambria Math" w:hAnsi="Cambria Math"/>
+                        </w:rPr>
+                        <m:t>b</m:t>
+                      </m:r>
+                    </m:e>
+                    <m:sub>
+                      <m:r>
+                        <w:rPr>
+                          <w:rFonts w:ascii="Cambria Math" w:hAnsi="Cambria Math"/>
+                        </w:rPr>
+                        <m:t>1</m:t>
+                      </m:r>
+                    </m:sub>
+                  </m:sSub>
+                </m:e>
+                <m:sup>
+                  <m:r>
+                    <w:rPr>
+                      <w:rFonts w:ascii="Cambria Math" w:hAnsi="Cambria Math"/>
+                    </w:rPr>
+                    <m:t>2</m:t>
+                  </m:r>
+                </m:sup>
+              </m:sSup>
+              <m:sSub>
+                <m:sSubPr>
+                  <m:ctrlPr>
+                    <w:rPr>
+                      <w:rFonts w:ascii="Cambria Math" w:hAnsi="Cambria Math"/>
+                      <w:i/>
+                    </w:rPr>
+                  </m:ctrlPr>
+                </m:sSubPr>
+                <m:e>
+                  <m:r>
+                    <w:rPr>
+                      <w:rFonts w:ascii="Cambria Math" w:hAnsi="Cambria Math"/>
+                    </w:rPr>
+                    <m:t>b</m:t>
+                  </m:r>
+                </m:e>
+                <m:sub>
+                  <m:r>
+                    <w:rPr>
+                      <w:rFonts w:ascii="Cambria Math" w:hAnsi="Cambria Math"/>
+                    </w:rPr>
+                    <m:t>2</m:t>
+                  </m:r>
+                </m:sub>
+              </m:sSub>
+              <m:r>
+                <w:rPr>
+                  <w:rFonts w:ascii="Cambria Math" w:hAnsi="Cambria Math"/>
+                </w:rPr>
+                <m:t>,</m:t>
+              </m:r>
+              <m:sSub>
+                <m:sSubPr>
+                  <m:ctrlPr>
+                    <w:rPr>
+                      <w:rFonts w:ascii="Cambria Math" w:hAnsi="Cambria Math"/>
+                      <w:i/>
+                    </w:rPr>
+                  </m:ctrlPr>
+                </m:sSubPr>
+                <m:e>
+                  <m:rad>
+                    <m:radPr>
+                      <m:degHide m:val="1"/>
+                      <m:ctrlPr>
+                        <w:rPr>
+                          <w:rFonts w:ascii="Cambria Math" w:hAnsi="Cambria Math"/>
+                          <w:i/>
+                        </w:rPr>
+                      </m:ctrlPr>
+                    </m:radPr>
+                    <m:deg/>
+                    <m:e>
+                      <m:r>
+                        <w:rPr>
+                          <w:rFonts w:ascii="Cambria Math" w:hAnsi="Cambria Math"/>
+                        </w:rPr>
+                        <m:t>3</m:t>
+                      </m:r>
+                    </m:e>
+                  </m:rad>
+                  <m:r>
+                    <w:rPr>
+                      <w:rFonts w:ascii="Cambria Math" w:hAnsi="Cambria Math"/>
+                    </w:rPr>
+                    <m:t>b</m:t>
+                  </m:r>
+                </m:e>
+                <m:sub>
+                  <m:r>
+                    <w:rPr>
+                      <w:rFonts w:ascii="Cambria Math" w:hAnsi="Cambria Math"/>
+                    </w:rPr>
+                    <m:t>1</m:t>
+                  </m:r>
+                </m:sub>
+              </m:sSub>
+              <m:sSup>
+                <m:sSupPr>
+                  <m:ctrlPr>
+                    <w:rPr>
+                      <w:rFonts w:ascii="Cambria Math" w:hAnsi="Cambria Math"/>
+                      <w:i/>
+                    </w:rPr>
+                  </m:ctrlPr>
+                </m:sSupPr>
+                <m:e>
+                  <m:sSub>
+                    <m:sSubPr>
+                      <m:ctrlPr>
+                        <w:rPr>
+                          <w:rFonts w:ascii="Cambria Math" w:hAnsi="Cambria Math"/>
+                          <w:i/>
+                        </w:rPr>
+                      </m:ctrlPr>
+                    </m:sSubPr>
+                    <m:e>
+                      <m:r>
+                        <w:rPr>
+                          <w:rFonts w:ascii="Cambria Math" w:hAnsi="Cambria Math"/>
+                        </w:rPr>
+                        <m:t>b</m:t>
+                      </m:r>
+                    </m:e>
+                    <m:sub>
+                      <m:r>
+                        <w:rPr>
+                          <w:rFonts w:ascii="Cambria Math" w:hAnsi="Cambria Math"/>
+                        </w:rPr>
+                        <m:t>2</m:t>
+                      </m:r>
+                    </m:sub>
+                  </m:sSub>
+                </m:e>
+                <m:sup>
+                  <m:r>
+                    <w:rPr>
+                      <w:rFonts w:ascii="Cambria Math" w:hAnsi="Cambria Math"/>
+                    </w:rPr>
+                    <m:t>2</m:t>
+                  </m:r>
+                </m:sup>
+              </m:sSup>
+              <m:r>
+                <w:rPr>
+                  <w:rFonts w:ascii="Cambria Math" w:hAnsi="Cambria Math"/>
+                </w:rPr>
+                <m:t>,</m:t>
+              </m:r>
+              <m:sSup>
+                <m:sSupPr>
+                  <m:ctrlPr>
+                    <w:rPr>
+                      <w:rFonts w:ascii="Cambria Math" w:hAnsi="Cambria Math"/>
+                      <w:i/>
+                    </w:rPr>
+                  </m:ctrlPr>
+                </m:sSupPr>
+                <m:e>
+                  <m:sSub>
+                    <m:sSubPr>
+                      <m:ctrlPr>
+                        <w:rPr>
+                          <w:rFonts w:ascii="Cambria Math" w:hAnsi="Cambria Math"/>
+                          <w:i/>
+                        </w:rPr>
+                      </m:ctrlPr>
+                    </m:sSubPr>
+                    <m:e>
+                      <m:r>
+                        <w:rPr>
+                          <w:rFonts w:ascii="Cambria Math" w:hAnsi="Cambria Math"/>
+                        </w:rPr>
+                        <m:t>b</m:t>
+                      </m:r>
+                    </m:e>
+                    <m:sub>
+                      <m:r>
+                        <w:rPr>
+                          <w:rFonts w:ascii="Cambria Math" w:hAnsi="Cambria Math"/>
+                        </w:rPr>
+                        <m:t>2</m:t>
+                      </m:r>
+                    </m:sub>
+                  </m:sSub>
+                </m:e>
+                <m:sup>
+                  <m:r>
+                    <w:rPr>
+                      <w:rFonts w:ascii="Cambria Math" w:hAnsi="Cambria Math"/>
+                    </w:rPr>
+                    <m:t>3</m:t>
+                  </m:r>
+                </m:sup>
+              </m:sSup>
+            </m:e>
+          </m:d>
+        </m:oMath>
+      </m:oMathPara>
+    </w:p>
+    <w:p>
+      <w:pPr>
+        <w:spacing w:line="334" w:lineRule="auto"/>
+        <w:ind w:left="0" w:firstLine="0"/>
+      </w:pPr>
+    </w:p>
+    <w:p>
+      <w:pPr>
         <w:numPr>
           <w:ilvl w:val="0"/>
           <w:numId w:val="1"/>
@@ -320,13 +2776,7 @@
         <w:t>,</w:t>
       </w:r>
       <w:r>
-        <w:t>1</w:t>
-      </w:r>
-      <w:r>
-        <w:t>}</w:t>
-      </w:r>
-      <w:r>
-        <w:t>:</w:t>
+        <w:t>1}:</w:t>
       </w:r>
     </w:p>
     <w:tbl>
@@ -337,7 +2787,6 @@
         <w:tblCellMar>
           <w:top w:w="36" w:type="dxa"/>
           <w:left w:w="100" w:type="dxa"/>
-          <w:bottom w:w="0" w:type="dxa"/>
           <w:right w:w="100" w:type="dxa"/>
         </w:tblCellMar>
         <w:tblLook w:val="04A0" w:firstRow="1" w:lastRow="0" w:firstColumn="1" w:lastColumn="0" w:noHBand="0" w:noVBand="1"/>
@@ -750,10 +3199,7 @@
       </w:r>
       <w:proofErr w:type="gramStart"/>
       <w:r>
-        <w:t>11</w:t>
-      </w:r>
-      <w:r>
-        <w:t>}</w:t>
+        <w:t>11}</w:t>
       </w:r>
       <w:r>
         <w:rPr>
@@ -762,6 +3208,16 @@
         <w:t>.</w:t>
       </w:r>
       <w:proofErr w:type="gramEnd"/>
+    </w:p>
+    <w:p>
+      <w:pPr>
+        <w:spacing w:after="160" w:line="278" w:lineRule="auto"/>
+        <w:ind w:left="0" w:firstLine="0"/>
+        <w:jc w:val="left"/>
+      </w:pPr>
+      <w:r>
+        <w:br w:type="page"/>
+      </w:r>
     </w:p>
     <w:p>
       <w:pPr>
@@ -769,7 +3225,600 @@
         <w:ind w:left="309"/>
       </w:pPr>
       <w:r>
+        <w:lastRenderedPageBreak/>
         <w:t>Compute the Gini impurity for each split! Which one should you choose to split the root node?</w:t>
+      </w:r>
+    </w:p>
+    <w:p>
+      <w:pPr>
+        <w:spacing w:after="191"/>
+        <w:ind w:left="309"/>
+        <w:rPr>
+          <w:b/>
+          <w:bCs/>
+        </w:rPr>
+      </w:pPr>
+      <w:r>
+        <w:rPr>
+          <w:b/>
+          <w:bCs/>
+        </w:rPr>
+        <w:t>Split 2.5</w:t>
+      </w:r>
+    </w:p>
+    <w:p>
+      <w:pPr>
+        <w:spacing w:after="191"/>
+        <w:ind w:left="309"/>
+      </w:pPr>
+      <w:r>
+        <w:t>Left x</w:t>
+      </w:r>
+      <w:r>
+        <w:t xml:space="preserve"> &lt;= 2.5</w:t>
+      </w:r>
+      <w:r>
+        <w:t>, n = 1</w:t>
+      </w:r>
+      <w:r>
+        <w:t>, Sample 1 -&gt;</w:t>
+      </w:r>
+      <w:r>
+        <w:t xml:space="preserve"> </w:t>
+      </w:r>
+      <w:r>
+        <w:t xml:space="preserve">y = </w:t>
+      </w:r>
+      <w:r>
+        <w:t>[0]</w:t>
+      </w:r>
+    </w:p>
+    <w:p>
+      <w:pPr>
+        <w:spacing w:after="191"/>
+        <w:ind w:left="309"/>
+        <w:rPr>
+          <w:vertAlign w:val="superscript"/>
+        </w:rPr>
+      </w:pPr>
+      <w:r>
+        <w:t xml:space="preserve">1 </w:t>
+      </w:r>
+      <w:r>
+        <w:t>– (1/1)</w:t>
+      </w:r>
+      <w:r>
+        <w:rPr>
+          <w:vertAlign w:val="superscript"/>
+        </w:rPr>
+        <w:t>2</w:t>
+      </w:r>
+      <w:r>
+        <w:t xml:space="preserve"> – (0/1)</w:t>
+      </w:r>
+      <w:r>
+        <w:rPr>
+          <w:vertAlign w:val="superscript"/>
+        </w:rPr>
+        <w:t>2</w:t>
+      </w:r>
+    </w:p>
+    <w:p>
+      <w:pPr>
+        <w:spacing w:after="191"/>
+        <w:ind w:left="309"/>
+      </w:pPr>
+      <w:r>
+        <w:t>Right x &gt; 2.5</w:t>
+      </w:r>
+      <w:r>
+        <w:t>:</w:t>
+      </w:r>
+      <w:r>
+        <w:t xml:space="preserve"> </w:t>
+      </w:r>
+      <w:r>
+        <w:t xml:space="preserve">n= 3, </w:t>
+      </w:r>
+      <w:r>
+        <w:t>Sample</w:t>
+      </w:r>
+      <w:r>
+        <w:t>s</w:t>
+      </w:r>
+      <w:r>
+        <w:t xml:space="preserve"> </w:t>
+      </w:r>
+      <w:r>
+        <w:t>2,3,4</w:t>
+      </w:r>
+      <w:r>
+        <w:t xml:space="preserve"> -&gt; </w:t>
+      </w:r>
+      <w:r>
+        <w:t>y =</w:t>
+      </w:r>
+      <w:r>
+        <w:t xml:space="preserve"> </w:t>
+      </w:r>
+      <w:r>
+        <w:t>[</w:t>
+      </w:r>
+      <w:r>
+        <w:t>0,1,1</w:t>
+      </w:r>
+      <w:r>
+        <w:t>]</w:t>
+      </w:r>
+    </w:p>
+    <w:p>
+      <w:pPr>
+        <w:spacing w:after="191"/>
+        <w:ind w:left="309"/>
+      </w:pPr>
+      <w:r>
+        <w:t xml:space="preserve">1 </w:t>
+      </w:r>
+      <w:r>
+        <w:t>–</w:t>
+      </w:r>
+      <w:r>
+        <w:t xml:space="preserve"> </w:t>
+      </w:r>
+      <w:r>
+        <w:t>(1/3)</w:t>
+      </w:r>
+      <w:r>
+        <w:rPr>
+          <w:vertAlign w:val="superscript"/>
+        </w:rPr>
+        <w:t>2</w:t>
+      </w:r>
+      <w:r>
+        <w:t xml:space="preserve"> – (2/3)</w:t>
+      </w:r>
+      <w:r>
+        <w:rPr>
+          <w:vertAlign w:val="superscript"/>
+        </w:rPr>
+        <w:t>2</w:t>
+      </w:r>
+      <w:r>
+        <w:t xml:space="preserve"> = 4/9</w:t>
+      </w:r>
+      <w:r>
+        <w:t xml:space="preserve"> = 0.444</w:t>
+      </w:r>
+    </w:p>
+    <w:p>
+      <w:pPr>
+        <w:pStyle w:val="ListParagraph"/>
+        <w:spacing w:after="191"/>
+        <w:ind w:left="299" w:firstLine="0"/>
+      </w:pPr>
+      <w:r>
+        <w:t xml:space="preserve">Split ¼ *0 </w:t>
+      </w:r>
+      <w:r>
+        <w:t>+ ¾</w:t>
+      </w:r>
+      <w:r>
+        <w:t xml:space="preserve"> * 4/9 </w:t>
+      </w:r>
+      <w:r>
+        <w:t xml:space="preserve">= </w:t>
+      </w:r>
+      <w:r>
+        <w:t>3/9 = 0.333</w:t>
+      </w:r>
+    </w:p>
+    <w:p>
+      <w:pPr>
+        <w:pStyle w:val="ListParagraph"/>
+        <w:spacing w:after="191"/>
+        <w:ind w:left="299" w:firstLine="0"/>
+      </w:pPr>
+    </w:p>
+    <w:p>
+      <w:pPr>
+        <w:pStyle w:val="ListParagraph"/>
+        <w:spacing w:after="191"/>
+        <w:ind w:left="299" w:firstLine="0"/>
+        <w:rPr>
+          <w:b/>
+          <w:bCs/>
+        </w:rPr>
+      </w:pPr>
+      <w:r>
+        <w:rPr>
+          <w:b/>
+          <w:bCs/>
+        </w:rPr>
+        <w:t xml:space="preserve">Split </w:t>
+      </w:r>
+      <w:r>
+        <w:rPr>
+          <w:b/>
+          <w:bCs/>
+        </w:rPr>
+        <w:t>6.5</w:t>
+      </w:r>
+    </w:p>
+    <w:p>
+      <w:pPr>
+        <w:pStyle w:val="ListParagraph"/>
+        <w:spacing w:after="191"/>
+        <w:ind w:left="299" w:firstLine="0"/>
+      </w:pPr>
+    </w:p>
+    <w:p>
+      <w:pPr>
+        <w:pStyle w:val="ListParagraph"/>
+        <w:spacing w:after="191"/>
+        <w:ind w:left="299" w:firstLine="0"/>
+      </w:pPr>
+      <w:r>
+        <w:t xml:space="preserve">Left x &lt;= 6.5, </w:t>
+      </w:r>
+      <w:r>
+        <w:t>n = 2, Samples 1,2 -&gt; y = [0,0]</w:t>
+      </w:r>
+    </w:p>
+    <w:p>
+      <w:pPr>
+        <w:pStyle w:val="ListParagraph"/>
+        <w:spacing w:after="191"/>
+        <w:ind w:left="299" w:firstLine="0"/>
+      </w:pPr>
+    </w:p>
+    <w:p>
+      <w:pPr>
+        <w:pStyle w:val="ListParagraph"/>
+        <w:spacing w:after="191"/>
+        <w:ind w:left="299" w:firstLine="0"/>
+      </w:pPr>
+      <w:r>
+        <w:t>1 – (2/2)</w:t>
+      </w:r>
+      <w:r>
+        <w:rPr>
+          <w:vertAlign w:val="superscript"/>
+        </w:rPr>
+        <w:t>2</w:t>
+      </w:r>
+      <w:r>
+        <w:t xml:space="preserve"> – (0/2)</w:t>
+      </w:r>
+      <w:r>
+        <w:rPr>
+          <w:vertAlign w:val="superscript"/>
+        </w:rPr>
+        <w:t>2</w:t>
+      </w:r>
+      <w:r>
+        <w:t xml:space="preserve"> = </w:t>
+      </w:r>
+      <w:r>
+        <w:t>1 – 1 = 0</w:t>
+      </w:r>
+    </w:p>
+    <w:p>
+      <w:pPr>
+        <w:pStyle w:val="ListParagraph"/>
+        <w:spacing w:after="191"/>
+        <w:ind w:left="299" w:firstLine="0"/>
+      </w:pPr>
+    </w:p>
+    <w:p>
+      <w:pPr>
+        <w:pStyle w:val="ListParagraph"/>
+        <w:spacing w:after="191"/>
+        <w:ind w:left="299" w:firstLine="0"/>
+      </w:pPr>
+      <w:r>
+        <w:t xml:space="preserve">Right x &gt; 6.5, n = 2, Samples 3, 5 </w:t>
+      </w:r>
+      <w:r>
+        <w:t>-&gt; y = [1,1]</w:t>
+      </w:r>
+    </w:p>
+    <w:p>
+      <w:pPr>
+        <w:pStyle w:val="ListParagraph"/>
+        <w:spacing w:after="191"/>
+        <w:ind w:left="299" w:firstLine="0"/>
+      </w:pPr>
+    </w:p>
+    <w:p>
+      <w:pPr>
+        <w:pStyle w:val="ListParagraph"/>
+        <w:spacing w:after="191"/>
+        <w:ind w:left="299" w:firstLine="0"/>
+      </w:pPr>
+      <w:r>
+        <w:t>1 – (</w:t>
+      </w:r>
+      <w:r>
+        <w:t>0</w:t>
+      </w:r>
+      <w:r>
+        <w:t>/2)</w:t>
+      </w:r>
+      <w:r>
+        <w:rPr>
+          <w:vertAlign w:val="superscript"/>
+        </w:rPr>
+        <w:t>2</w:t>
+      </w:r>
+      <w:r>
+        <w:t xml:space="preserve"> </w:t>
+      </w:r>
+      <w:r>
+        <w:t>–</w:t>
+      </w:r>
+      <w:r>
+        <w:t xml:space="preserve"> </w:t>
+      </w:r>
+      <w:r>
+        <w:t>(</w:t>
+      </w:r>
+      <w:r>
+        <w:t>2</w:t>
+      </w:r>
+      <w:r>
+        <w:t>/2)</w:t>
+      </w:r>
+      <w:r>
+        <w:rPr>
+          <w:vertAlign w:val="superscript"/>
+        </w:rPr>
+        <w:t>2</w:t>
+      </w:r>
+      <w:r>
+        <w:t xml:space="preserve"> = 1 – 1 = 0</w:t>
+      </w:r>
+    </w:p>
+    <w:p>
+      <w:pPr>
+        <w:pStyle w:val="ListParagraph"/>
+        <w:spacing w:after="191"/>
+        <w:ind w:left="299" w:firstLine="0"/>
+      </w:pPr>
+    </w:p>
+    <w:p>
+      <w:pPr>
+        <w:pStyle w:val="ListParagraph"/>
+        <w:spacing w:after="191"/>
+        <w:ind w:left="299" w:firstLine="0"/>
+      </w:pPr>
+      <w:r>
+        <w:t xml:space="preserve">Split 2/4 * </w:t>
+      </w:r>
+      <w:r>
+        <w:t>0 + 2/4 * 0 = 0</w:t>
+      </w:r>
+    </w:p>
+    <w:p>
+      <w:pPr>
+        <w:pStyle w:val="ListParagraph"/>
+        <w:spacing w:after="191"/>
+        <w:ind w:left="299" w:firstLine="0"/>
+      </w:pPr>
+    </w:p>
+    <w:p>
+      <w:pPr>
+        <w:pStyle w:val="ListParagraph"/>
+        <w:spacing w:after="191"/>
+        <w:ind w:left="299" w:firstLine="0"/>
+        <w:rPr>
+          <w:b/>
+          <w:bCs/>
+        </w:rPr>
+      </w:pPr>
+      <w:r>
+        <w:rPr>
+          <w:b/>
+          <w:bCs/>
+        </w:rPr>
+        <w:t xml:space="preserve">Split </w:t>
+      </w:r>
+      <w:r>
+        <w:rPr>
+          <w:b/>
+          <w:bCs/>
+        </w:rPr>
+        <w:t>11</w:t>
+      </w:r>
+    </w:p>
+    <w:p>
+      <w:pPr>
+        <w:pStyle w:val="ListParagraph"/>
+        <w:spacing w:after="191"/>
+        <w:ind w:left="299" w:firstLine="0"/>
+      </w:pPr>
+    </w:p>
+    <w:p>
+      <w:pPr>
+        <w:pStyle w:val="ListParagraph"/>
+        <w:spacing w:after="191"/>
+        <w:ind w:left="299" w:firstLine="0"/>
+      </w:pPr>
+      <w:r>
+        <w:t>Left</w:t>
+      </w:r>
+      <w:r>
+        <w:t xml:space="preserve"> x &lt;= 11</w:t>
+      </w:r>
+      <w:r>
+        <w:t xml:space="preserve">, n = 3, Samples </w:t>
+      </w:r>
+      <w:r>
+        <w:t>1,2,3 -&gt; y = [0,0,1]</w:t>
+      </w:r>
+    </w:p>
+    <w:p>
+      <w:pPr>
+        <w:pStyle w:val="ListParagraph"/>
+        <w:spacing w:after="191"/>
+        <w:ind w:left="299" w:firstLine="0"/>
+      </w:pPr>
+    </w:p>
+    <w:p>
+      <w:pPr>
+        <w:pStyle w:val="ListParagraph"/>
+        <w:spacing w:after="191"/>
+        <w:ind w:left="299" w:firstLine="0"/>
+      </w:pPr>
+      <w:r>
+        <w:t xml:space="preserve">1 </w:t>
+      </w:r>
+      <w:r>
+        <w:t>–</w:t>
+      </w:r>
+      <w:r>
+        <w:t xml:space="preserve"> </w:t>
+      </w:r>
+      <w:r>
+        <w:t>(2/3)</w:t>
+      </w:r>
+      <w:r>
+        <w:rPr>
+          <w:vertAlign w:val="superscript"/>
+        </w:rPr>
+        <w:t>2</w:t>
+      </w:r>
+      <w:r>
+        <w:t xml:space="preserve"> – (1/3)</w:t>
+      </w:r>
+      <w:r>
+        <w:rPr>
+          <w:vertAlign w:val="superscript"/>
+        </w:rPr>
+        <w:t>2</w:t>
+      </w:r>
+      <w:r>
+        <w:t xml:space="preserve"> = </w:t>
+      </w:r>
+      <w:r>
+        <w:t>4/9 = 0.444</w:t>
+      </w:r>
+    </w:p>
+    <w:p>
+      <w:pPr>
+        <w:pStyle w:val="ListParagraph"/>
+        <w:spacing w:after="191"/>
+        <w:ind w:left="299" w:firstLine="0"/>
+      </w:pPr>
+    </w:p>
+    <w:p>
+      <w:pPr>
+        <w:pStyle w:val="ListParagraph"/>
+        <w:spacing w:after="191"/>
+        <w:ind w:left="299" w:firstLine="0"/>
+      </w:pPr>
+      <w:r>
+        <w:t xml:space="preserve">Right x &gt; 11, n = 1, Sample 4 -&gt; </w:t>
+      </w:r>
+      <w:r>
+        <w:t>y = [1]</w:t>
+      </w:r>
+    </w:p>
+    <w:p>
+      <w:pPr>
+        <w:pStyle w:val="ListParagraph"/>
+        <w:spacing w:after="191"/>
+        <w:ind w:left="299" w:firstLine="0"/>
+      </w:pPr>
+    </w:p>
+    <w:p>
+      <w:pPr>
+        <w:pStyle w:val="ListParagraph"/>
+        <w:spacing w:after="191"/>
+        <w:ind w:left="299" w:firstLine="0"/>
+      </w:pPr>
+      <w:r>
+        <w:t xml:space="preserve">1 </w:t>
+      </w:r>
+      <w:r>
+        <w:t>–</w:t>
+      </w:r>
+      <w:r>
+        <w:t xml:space="preserve"> </w:t>
+      </w:r>
+      <w:r>
+        <w:t>(</w:t>
+      </w:r>
+      <w:r>
+        <w:t>0</w:t>
+      </w:r>
+      <w:r>
+        <w:t>/1)</w:t>
+      </w:r>
+      <w:r>
+        <w:rPr>
+          <w:vertAlign w:val="superscript"/>
+        </w:rPr>
+        <w:t>2</w:t>
+      </w:r>
+      <w:r>
+        <w:t xml:space="preserve"> – (1/1)</w:t>
+      </w:r>
+      <w:r>
+        <w:rPr>
+          <w:vertAlign w:val="superscript"/>
+        </w:rPr>
+        <w:t>2</w:t>
+      </w:r>
+      <w:r>
+        <w:t xml:space="preserve"> = </w:t>
+      </w:r>
+      <w:r>
+        <w:t>0</w:t>
+      </w:r>
+    </w:p>
+    <w:p>
+      <w:pPr>
+        <w:pStyle w:val="ListParagraph"/>
+        <w:spacing w:after="191"/>
+        <w:ind w:left="299" w:firstLine="0"/>
+      </w:pPr>
+    </w:p>
+    <w:p>
+      <w:pPr>
+        <w:pStyle w:val="ListParagraph"/>
+        <w:spacing w:after="191"/>
+        <w:ind w:left="299" w:firstLine="0"/>
+      </w:pPr>
+      <w:r>
+        <w:t>Split</w:t>
+      </w:r>
+      <w:r>
+        <w:t xml:space="preserve"> ¾ * 4/9 + ¼ * 0 = 0.333</w:t>
+      </w:r>
+    </w:p>
+    <w:p>
+      <w:pPr>
+        <w:pStyle w:val="ListParagraph"/>
+        <w:spacing w:after="191"/>
+        <w:ind w:left="299" w:firstLine="0"/>
+      </w:pPr>
+    </w:p>
+    <w:p>
+      <w:pPr>
+        <w:pStyle w:val="ListParagraph"/>
+        <w:spacing w:after="191"/>
+        <w:ind w:left="299" w:firstLine="0"/>
+        <w:rPr>
+          <w:b/>
+          <w:bCs/>
+        </w:rPr>
+      </w:pPr>
+      <w:r>
+        <w:rPr>
+          <w:b/>
+          <w:bCs/>
+        </w:rPr>
+        <w:t>Minimum Gini for 6.5</w:t>
       </w:r>
     </w:p>
     <w:p>
@@ -1059,6 +4108,7 @@
         <w:ind w:left="815" w:hanging="237"/>
       </w:pPr>
       <w:r>
+        <w:lastRenderedPageBreak/>
         <w:t xml:space="preserve">Use grid search with cross-validation (with the help of the </w:t>
       </w:r>
       <w:proofErr w:type="spellStart"/>
@@ -1106,7 +4156,6 @@
         <w:jc w:val="center"/>
       </w:pPr>
       <w:r>
-        <w:lastRenderedPageBreak/>
         <w:t>1</w:t>
       </w:r>
     </w:p>
@@ -1752,7 +4801,6 @@
   <w:style w:type="character" w:default="1" w:styleId="DefaultParagraphFont">
     <w:name w:val="Default Paragraph Font"/>
     <w:uiPriority w:val="1"/>
-    <w:semiHidden/>
     <w:unhideWhenUsed/>
   </w:style>
   <w:style w:type="table" w:default="1" w:styleId="TableNormal">
@@ -1789,6 +4837,97 @@
         <w:right w:w="0" w:type="dxa"/>
       </w:tblCellMar>
     </w:tblPr>
+  </w:style>
+  <w:style w:type="character" w:styleId="PlaceholderText">
+    <w:name w:val="Placeholder Text"/>
+    <w:basedOn w:val="DefaultParagraphFont"/>
+    <w:uiPriority w:val="99"/>
+    <w:semiHidden/>
+    <w:rsid w:val="00DC1882"/>
+    <w:rPr>
+      <w:color w:val="666666"/>
+    </w:rPr>
+  </w:style>
+  <w:style w:type="character" w:styleId="CommentReference">
+    <w:name w:val="annotation reference"/>
+    <w:basedOn w:val="DefaultParagraphFont"/>
+    <w:uiPriority w:val="99"/>
+    <w:semiHidden/>
+    <w:unhideWhenUsed/>
+    <w:rsid w:val="003C098F"/>
+    <w:rPr>
+      <w:sz w:val="16"/>
+      <w:szCs w:val="16"/>
+    </w:rPr>
+  </w:style>
+  <w:style w:type="paragraph" w:styleId="CommentText">
+    <w:name w:val="annotation text"/>
+    <w:basedOn w:val="Normal"/>
+    <w:link w:val="CommentTextChar"/>
+    <w:uiPriority w:val="99"/>
+    <w:unhideWhenUsed/>
+    <w:rsid w:val="003C098F"/>
+    <w:pPr>
+      <w:spacing w:line="240" w:lineRule="auto"/>
+    </w:pPr>
+    <w:rPr>
+      <w:sz w:val="20"/>
+      <w:szCs w:val="20"/>
+    </w:rPr>
+  </w:style>
+  <w:style w:type="character" w:customStyle="1" w:styleId="CommentTextChar">
+    <w:name w:val="Comment Text Char"/>
+    <w:basedOn w:val="DefaultParagraphFont"/>
+    <w:link w:val="CommentText"/>
+    <w:uiPriority w:val="99"/>
+    <w:rsid w:val="003C098F"/>
+    <w:rPr>
+      <w:rFonts w:ascii="Cambria" w:eastAsia="Cambria" w:hAnsi="Cambria" w:cs="Cambria"/>
+      <w:color w:val="000000"/>
+      <w:sz w:val="20"/>
+      <w:szCs w:val="20"/>
+    </w:rPr>
+  </w:style>
+  <w:style w:type="paragraph" w:styleId="CommentSubject">
+    <w:name w:val="annotation subject"/>
+    <w:basedOn w:val="CommentText"/>
+    <w:next w:val="CommentText"/>
+    <w:link w:val="CommentSubjectChar"/>
+    <w:uiPriority w:val="99"/>
+    <w:semiHidden/>
+    <w:unhideWhenUsed/>
+    <w:rsid w:val="003C098F"/>
+    <w:rPr>
+      <w:b/>
+      <w:bCs/>
+    </w:rPr>
+  </w:style>
+  <w:style w:type="character" w:customStyle="1" w:styleId="CommentSubjectChar">
+    <w:name w:val="Comment Subject Char"/>
+    <w:basedOn w:val="CommentTextChar"/>
+    <w:link w:val="CommentSubject"/>
+    <w:uiPriority w:val="99"/>
+    <w:semiHidden/>
+    <w:rsid w:val="003C098F"/>
+    <w:rPr>
+      <w:rFonts w:ascii="Cambria" w:eastAsia="Cambria" w:hAnsi="Cambria" w:cs="Cambria"/>
+      <w:b/>
+      <w:bCs/>
+      <w:color w:val="000000"/>
+      <w:sz w:val="20"/>
+      <w:szCs w:val="20"/>
+    </w:rPr>
+  </w:style>
+  <w:style w:type="paragraph" w:styleId="ListParagraph">
+    <w:name w:val="List Paragraph"/>
+    <w:basedOn w:val="Normal"/>
+    <w:uiPriority w:val="34"/>
+    <w:qFormat/>
+    <w:rsid w:val="00640624"/>
+    <w:pPr>
+      <w:ind w:left="720"/>
+      <w:contextualSpacing/>
+    </w:pPr>
   </w:style>
 </w:styles>
 </file>

</xml_diff>